<commit_message>
docs(Vision): updated vision document
</commit_message>
<xml_diff>
--- a/docs/01 Vision.docx
+++ b/docs/01 Vision.docx
@@ -361,19 +361,7 @@
               <w:spacing w:before="240" w:after="240"/>
             </w:pPr>
             <w:r>
-              <w:t>17</w:t>
-            </w:r>
-            <w:r>
-              <w:t>/</w:t>
-            </w:r>
-            <w:r>
-              <w:t>03</w:t>
-            </w:r>
-            <w:r>
-              <w:t>/</w:t>
-            </w:r>
-            <w:r>
-              <w:t>2026</w:t>
+              <w:t>17/03/2026</w:t>
             </w:r>
           </w:p>
         </w:tc>
@@ -398,13 +386,7 @@
               <w:spacing w:before="240" w:after="240"/>
             </w:pPr>
             <w:r>
-              <w:t>1</w:t>
-            </w:r>
-            <w:r>
-              <w:t>.</w:t>
-            </w:r>
-            <w:r>
-              <w:t>0</w:t>
+              <w:t>1.0</w:t>
             </w:r>
           </w:p>
         </w:tc>
@@ -486,6 +468,9 @@
             <w:r>
               <w:t xml:space="preserve"> </w:t>
             </w:r>
+            <w:r>
+              <w:t>28/03/2026</w:t>
+            </w:r>
           </w:p>
         </w:tc>
         <w:tc>
@@ -511,6 +496,9 @@
             <w:r>
               <w:t xml:space="preserve"> </w:t>
             </w:r>
+            <w:r>
+              <w:t>2.0</w:t>
+            </w:r>
           </w:p>
         </w:tc>
         <w:tc>
@@ -536,6 +524,9 @@
             <w:r>
               <w:t xml:space="preserve"> </w:t>
             </w:r>
+            <w:r>
+              <w:t>Second version, wrote full documentation</w:t>
+            </w:r>
           </w:p>
         </w:tc>
         <w:tc>
@@ -557,9 +548,21 @@
           <w:p>
             <w:pPr>
               <w:spacing w:before="240" w:after="240"/>
+              <w:rPr>
+                <w:lang w:val="en-US"/>
+              </w:rPr>
             </w:pPr>
             <w:r>
               <w:t xml:space="preserve"> </w:t>
+            </w:r>
+            <w:r>
+              <w:t>Mule</w:t>
+            </w:r>
+            <w:r>
+              <w:rPr>
+                <w:lang w:val="en-US"/>
+              </w:rPr>
+              <w:t>ș Alexandru</w:t>
             </w:r>
           </w:p>
         </w:tc>
@@ -966,7 +969,21 @@
                 <w:color w:val="1155CC"/>
                 <w:u w:val="single"/>
               </w:rPr>
-              <w:t>1. Introduction</w:t>
+              <w:t>1. I</w:t>
+            </w:r>
+            <w:r>
+              <w:rPr>
+                <w:color w:val="1155CC"/>
+                <w:u w:val="single"/>
+              </w:rPr>
+              <w:t>n</w:t>
+            </w:r>
+            <w:r>
+              <w:rPr>
+                <w:color w:val="1155CC"/>
+                <w:u w:val="single"/>
+              </w:rPr>
+              <w:t>troduction</w:t>
             </w:r>
           </w:hyperlink>
         </w:p>
@@ -1345,7 +1362,6 @@
       <w:bookmarkStart w:id="0" w:name="_tysps3mvjxx7" w:colFirst="0" w:colLast="0"/>
       <w:bookmarkEnd w:id="0"/>
       <w:r>
-        <w:lastRenderedPageBreak/>
         <w:t>1. Introduction</w:t>
       </w:r>
     </w:p>
@@ -1604,8 +1620,154 @@
       </w:r>
     </w:p>
     <w:p>
-      <w:r>
-        <w:t>[This subsection provides a complete list of all documents referenced elsewhere in the Vision document. Identify each document by title, report number (if applicable), date, and publishing organization. Specify the sources from which the references can be obtained. This information may be provided by reference to an appendix or to another document.]</w:t>
+      <w:pPr>
+        <w:pStyle w:val="ListParagraph"/>
+        <w:numPr>
+          <w:ilvl w:val="0"/>
+          <w:numId w:val="7"/>
+        </w:numPr>
+      </w:pPr>
+      <w:r>
+        <w:t xml:space="preserve">Vision document format and content: </w:t>
+      </w:r>
+      <w:hyperlink r:id="rId8" w:history="1">
+        <w:r>
+          <w:rPr>
+            <w:rStyle w:val="Hyperlink"/>
+          </w:rPr>
+          <w:t>https://www.ibm.com/docs/en/engineering-lifecycle-management-suite/doors-next/7.0.3?topic=requirements-vision-document</w:t>
+        </w:r>
+      </w:hyperlink>
+    </w:p>
+    <w:p>
+      <w:pPr>
+        <w:pStyle w:val="ListParagraph"/>
+        <w:numPr>
+          <w:ilvl w:val="0"/>
+          <w:numId w:val="7"/>
+        </w:numPr>
+      </w:pPr>
+      <w:r>
+        <w:lastRenderedPageBreak/>
+        <w:t xml:space="preserve">Chatbot design: </w:t>
+      </w:r>
+      <w:hyperlink r:id="rId9" w:history="1">
+        <w:r>
+          <w:rPr>
+            <w:rStyle w:val="Hyperlink"/>
+          </w:rPr>
+          <w:t>https://www.ibm.com/think/topics/chatbot-design</w:t>
+        </w:r>
+      </w:hyperlink>
+    </w:p>
+    <w:p>
+      <w:pPr>
+        <w:pStyle w:val="ListParagraph"/>
+        <w:numPr>
+          <w:ilvl w:val="0"/>
+          <w:numId w:val="7"/>
+        </w:numPr>
+      </w:pPr>
+      <w:r>
+        <w:t>Designing a chatbot from scratch — your how-to guide</w:t>
+      </w:r>
+      <w:r>
+        <w:t xml:space="preserve">: </w:t>
+      </w:r>
+      <w:hyperlink r:id="rId10" w:history="1">
+        <w:r>
+          <w:rPr>
+            <w:rStyle w:val="Hyperlink"/>
+          </w:rPr>
+          <w:t>https://medium.com/@anagrit/designing-a-chatbot-from-scratch-your-how-to-guide-fd760d0e4391</w:t>
+        </w:r>
+      </w:hyperlink>
+    </w:p>
+    <w:p>
+      <w:pPr>
+        <w:pStyle w:val="ListParagraph"/>
+        <w:numPr>
+          <w:ilvl w:val="0"/>
+          <w:numId w:val="7"/>
+        </w:numPr>
+      </w:pPr>
+      <w:r>
+        <w:t>How to design a chatbot for your use case</w:t>
+      </w:r>
+      <w:r>
+        <w:t xml:space="preserve">: </w:t>
+      </w:r>
+      <w:hyperlink r:id="rId11" w:history="1">
+        <w:r>
+          <w:rPr>
+            <w:rStyle w:val="Hyperlink"/>
+          </w:rPr>
+          <w:t>https://www.justinmind.com/ux-design/chatbot</w:t>
+        </w:r>
+      </w:hyperlink>
+    </w:p>
+    <w:p>
+      <w:pPr>
+        <w:pStyle w:val="ListParagraph"/>
+        <w:numPr>
+          <w:ilvl w:val="0"/>
+          <w:numId w:val="7"/>
+        </w:numPr>
+      </w:pPr>
+      <w:r>
+        <w:t>Rule-Based Chatbots: Examples &amp; Possible Applications</w:t>
+      </w:r>
+      <w:r>
+        <w:t xml:space="preserve">: </w:t>
+      </w:r>
+      <w:hyperlink r:id="rId12" w:history="1">
+        <w:r>
+          <w:rPr>
+            <w:rStyle w:val="Hyperlink"/>
+          </w:rPr>
+          <w:t>https://www.moin.ai/en/chatbot-wiki/rule-based-chatbots</w:t>
+        </w:r>
+      </w:hyperlink>
+    </w:p>
+    <w:p>
+      <w:pPr>
+        <w:pStyle w:val="ListParagraph"/>
+        <w:numPr>
+          <w:ilvl w:val="0"/>
+          <w:numId w:val="7"/>
+        </w:numPr>
+      </w:pPr>
+      <w:r>
+        <w:t>Learn how to build a chatbot</w:t>
+      </w:r>
+      <w:r>
+        <w:t xml:space="preserve">: </w:t>
+      </w:r>
+      <w:hyperlink r:id="rId13" w:history="1">
+        <w:r>
+          <w:rPr>
+            <w:rStyle w:val="Hyperlink"/>
+          </w:rPr>
+          <w:t>https://www.microsoft.com/en-us/microsoft-copilot/copilot-101/how-to-create-a-chatbot</w:t>
+        </w:r>
+      </w:hyperlink>
+    </w:p>
+    <w:p>
+      <w:pPr>
+        <w:pStyle w:val="ListParagraph"/>
+        <w:numPr>
+          <w:ilvl w:val="0"/>
+          <w:numId w:val="7"/>
+        </w:numPr>
+      </w:pPr>
+      <w:r>
+        <w:t>Rule-Based Chatbots: A Beginner’s Guide with Examples</w:t>
+      </w:r>
+      <w:r>
+        <w:t xml:space="preserve">: </w:t>
+      </w:r>
+      <w:r>
+        <w:t>https://herothemes.com/blog/rule-based-chatbots/</w:t>
       </w:r>
     </w:p>
     <w:p/>
@@ -1616,16 +1778,95 @@
       <w:bookmarkStart w:id="3" w:name="_v4db2ragx0p3" w:colFirst="0" w:colLast="0"/>
       <w:bookmarkEnd w:id="3"/>
       <w:r>
-        <w:lastRenderedPageBreak/>
         <w:t>1.5 Overview</w:t>
       </w:r>
     </w:p>
     <w:p>
-      <w:r>
-        <w:t>[This subsection describes what the rest of the Vision document contains and explains how the document is organized.]</w:t>
-      </w:r>
-    </w:p>
-    <w:p/>
+      <w:pPr>
+        <w:jc w:val="both"/>
+      </w:pPr>
+      <w:r>
+        <w:t>This Vision document is organized into three main remaining chapters that provide a comprehensive roadmap of the project:</w:t>
+      </w:r>
+    </w:p>
+    <w:p>
+      <w:pPr>
+        <w:pStyle w:val="ListParagraph"/>
+        <w:numPr>
+          <w:ilvl w:val="0"/>
+          <w:numId w:val="3"/>
+        </w:numPr>
+        <w:jc w:val="both"/>
+      </w:pPr>
+      <w:r>
+        <w:rPr>
+          <w:b/>
+          <w:bCs/>
+        </w:rPr>
+        <w:t>Section 2: Positioning</w:t>
+      </w:r>
+      <w:r>
+        <w:t xml:space="preserve"> </w:t>
+      </w:r>
+      <w:r>
+        <w:t>-</w:t>
+      </w:r>
+      <w:r>
+        <w:t xml:space="preserve"> Describes the business context and the specific problem this chat application aims to solve. It defines the unique value proposition and how the product compares to existing alternatives.</w:t>
+      </w:r>
+    </w:p>
+    <w:p>
+      <w:pPr>
+        <w:pStyle w:val="ListParagraph"/>
+        <w:numPr>
+          <w:ilvl w:val="0"/>
+          <w:numId w:val="3"/>
+        </w:numPr>
+        <w:jc w:val="both"/>
+      </w:pPr>
+      <w:r>
+        <w:rPr>
+          <w:b/>
+          <w:bCs/>
+        </w:rPr>
+        <w:t>Section 3: Stakeholder and User Descriptions</w:t>
+      </w:r>
+      <w:r>
+        <w:t xml:space="preserve"> </w:t>
+      </w:r>
+      <w:r>
+        <w:t>-</w:t>
+      </w:r>
+      <w:r>
+        <w:t xml:space="preserve"> Identifies the key individuals and groups involved in the project, profiling the target end-users and the environment in which they will interact with the system.</w:t>
+      </w:r>
+    </w:p>
+    <w:p>
+      <w:pPr>
+        <w:pStyle w:val="ListParagraph"/>
+        <w:numPr>
+          <w:ilvl w:val="0"/>
+          <w:numId w:val="3"/>
+        </w:numPr>
+        <w:jc w:val="both"/>
+      </w:pPr>
+      <w:r>
+        <w:rPr>
+          <w:b/>
+          <w:bCs/>
+        </w:rPr>
+        <w:t>Section 4: Product Requirements</w:t>
+      </w:r>
+      <w:r>
+        <w:t xml:space="preserve"> </w:t>
+      </w:r>
+      <w:r>
+        <w:t>-</w:t>
+      </w:r>
+      <w:r>
+        <w:t xml:space="preserve"> Outlines the high-level technical constraints, including hardware requirements, platform standards, and performance expectations necessary for a successful implementation.</w:t>
+      </w:r>
+    </w:p>
     <w:p>
       <w:pPr>
         <w:pStyle w:val="Heading2"/>
@@ -1647,30 +1888,33 @@
       </w:r>
     </w:p>
     <w:p>
-      <w:r>
-        <w:t>[Briefly describe the business opportunity being met by this project.]</w:t>
-      </w:r>
-    </w:p>
-    <w:p>
       <w:pPr>
         <w:pStyle w:val="Heading2"/>
-      </w:pPr>
-      <w:bookmarkStart w:id="6" w:name="_1avp5nfxai19" w:colFirst="0" w:colLast="0"/>
+        <w:ind w:firstLine="720"/>
+        <w:jc w:val="both"/>
+        <w:rPr>
+          <w:sz w:val="22"/>
+          <w:szCs w:val="22"/>
+        </w:rPr>
+      </w:pPr>
+      <w:r>
+        <w:rPr>
+          <w:sz w:val="22"/>
+          <w:szCs w:val="22"/>
+        </w:rPr>
+        <w:t>The business opportunity lies in the growing demand for accessible, lightweight digital assistants that offer instant interaction without the complexity or privacy concerns of large-scale social platforms. There is a clear niche for applications that provide a private, localized 'Personal Assistant' experience, focusing on quick utility and on-demand entertainment. By providing a platform where users can manage a personal profile, interact with a responsive bot for information (time, help) and entertainment (jokes, trivia), the project addresses the need for seamless digital interaction. Furthermore, a key opportunity is found in data ownership and portability: unlike most mainstream chat apps that keep user data locked in proprietary clouds, this application allows users to export their entire chat history in standard formats (JSON/XML), giving them full control over their digital interactions and personal history.</w:t>
+      </w:r>
+    </w:p>
+    <w:p/>
+    <w:p>
+      <w:pPr>
+        <w:pStyle w:val="Heading2"/>
+      </w:pPr>
+      <w:bookmarkStart w:id="6" w:name="_qnd3zqp496x" w:colFirst="0" w:colLast="0"/>
       <w:bookmarkEnd w:id="6"/>
-    </w:p>
-    <w:p>
-      <w:pPr>
-        <w:pStyle w:val="Heading2"/>
-      </w:pPr>
-      <w:bookmarkStart w:id="7" w:name="_qnd3zqp496x" w:colFirst="0" w:colLast="0"/>
-      <w:bookmarkEnd w:id="7"/>
-      <w:r>
+      <w:r>
+        <w:lastRenderedPageBreak/>
         <w:t>2.2 Problem Statement</w:t>
-      </w:r>
-    </w:p>
-    <w:p>
-      <w:r>
-        <w:t>[Provide a statement summarizing the problem being solved by this project. The following format may be used:]</w:t>
       </w:r>
     </w:p>
     <w:p/>
@@ -1745,7 +1989,7 @@
               <w:spacing w:line="240" w:lineRule="auto"/>
             </w:pPr>
             <w:r>
-              <w:t>[describe the problem]</w:t>
+              <w:t>mainstream apps being too cluttered, slow, and keeping user data locked behind complex privacy settings,</w:t>
             </w:r>
           </w:p>
         </w:tc>
@@ -1801,7 +2045,7 @@
               <w:spacing w:line="240" w:lineRule="auto"/>
             </w:pPr>
             <w:r>
-              <w:t>[the stakeholders affected by the problem]</w:t>
+              <w:t>people who want a simple and private way to get quick information or entertainment without being tracked or overwhelmed by unnecessary features,</w:t>
             </w:r>
           </w:p>
         </w:tc>
@@ -1857,7 +2101,7 @@
               <w:spacing w:line="240" w:lineRule="auto"/>
             </w:pPr>
             <w:r>
-              <w:t>[what is the impact of the problem?]</w:t>
+              <w:t>that users feel they have no real control over their own data and are forced to use heavy, complicated platforms for even the simplest tasks,</w:t>
             </w:r>
           </w:p>
         </w:tc>
@@ -1913,7 +2157,7 @@
               <w:spacing w:line="240" w:lineRule="auto"/>
             </w:pPr>
             <w:r>
-              <w:t>[list some key benefits of a successful solution]</w:t>
+              <w:t>a fast, lightweight digital assistant that provides a secure and private environment, respects user privacy, and allows everyone to easily download and own their entire history in a simple format.</w:t>
             </w:r>
           </w:p>
         </w:tc>
@@ -1923,15 +2167,20 @@
       <w:pPr>
         <w:pStyle w:val="Heading2"/>
       </w:pPr>
-      <w:bookmarkStart w:id="8" w:name="_9rcetpubfiwh" w:colFirst="0" w:colLast="0"/>
-      <w:bookmarkEnd w:id="8"/>
+      <w:bookmarkStart w:id="7" w:name="_9rcetpubfiwh" w:colFirst="0" w:colLast="0"/>
+      <w:bookmarkEnd w:id="7"/>
+    </w:p>
+    <w:p>
+      <w:pPr>
+        <w:pStyle w:val="Heading2"/>
+      </w:pPr>
+    </w:p>
+    <w:p>
+      <w:pPr>
+        <w:pStyle w:val="Heading2"/>
+      </w:pPr>
       <w:r>
         <w:t>2.3 Product Position Statement</w:t>
-      </w:r>
-    </w:p>
-    <w:p>
-      <w:r>
-        <w:t>[Provide an overall statement summarizing, at the highest level, the unique position the product intends to fill in the marketplace. The following format may be used:]</w:t>
       </w:r>
     </w:p>
     <w:p/>
@@ -2006,7 +2255,7 @@
               <w:spacing w:line="240" w:lineRule="auto"/>
             </w:pPr>
             <w:r>
-              <w:t>[target customer]</w:t>
+              <w:t>privacy-conscious users and individuals seeking a fast, uncluttered digital experience,</w:t>
             </w:r>
           </w:p>
         </w:tc>
@@ -2062,7 +2311,7 @@
               <w:spacing w:line="240" w:lineRule="auto"/>
             </w:pPr>
             <w:r>
-              <w:t>[statement of the need or opportunity]</w:t>
+              <w:t>need immediate access to utility and entertainment without the privacy risks or complexity of large-scale social platforms,</w:t>
             </w:r>
           </w:p>
         </w:tc>
@@ -2093,7 +2342,16 @@
               <w:spacing w:line="240" w:lineRule="auto"/>
             </w:pPr>
             <w:r>
-              <w:t>The (product name)</w:t>
+              <w:t xml:space="preserve">The </w:t>
+            </w:r>
+            <w:r>
+              <w:rPr>
+                <w:b/>
+                <w:bCs/>
+                <w:i/>
+                <w:iCs/>
+              </w:rPr>
+              <w:t>ChattyBot</w:t>
             </w:r>
           </w:p>
         </w:tc>
@@ -2118,7 +2376,7 @@
               <w:spacing w:line="240" w:lineRule="auto"/>
             </w:pPr>
             <w:r>
-              <w:t>is a [product category]</w:t>
+              <w:t>is a lightweight, secure digital assistant platform,</w:t>
             </w:r>
           </w:p>
         </w:tc>
@@ -2174,7 +2432,7 @@
               <w:spacing w:line="240" w:lineRule="auto"/>
             </w:pPr>
             <w:r>
-              <w:t>[statement of key benefit; that is, the compelling reason to buy]</w:t>
+              <w:t>facilitates seamless, rule-based interactions while ensuring users retain full and permanent control over their personal data,</w:t>
             </w:r>
           </w:p>
         </w:tc>
@@ -2230,7 +2488,7 @@
               <w:spacing w:line="240" w:lineRule="auto"/>
             </w:pPr>
             <w:r>
-              <w:t>[primary competitive alternative]</w:t>
+              <w:t>mainstream messaging apps and cloud-based bots that lock user history in proprietary systems and prioritize data collection over simplicity,</w:t>
             </w:r>
           </w:p>
         </w:tc>
@@ -2286,65 +2544,51 @@
               <w:spacing w:line="240" w:lineRule="auto"/>
             </w:pPr>
             <w:r>
-              <w:t>[statement of primary differentiation]</w:t>
+              <w:t>focuses on high-speed utility and total data portability, allowing users to own and export their entire interaction history in standard formats whenever they choose.</w:t>
             </w:r>
           </w:p>
         </w:tc>
       </w:tr>
     </w:tbl>
     <w:p>
-      <w:r>
-        <w:t>[A product position statement communicates the intent of the application and the importance of the project to all concerned personnel.]</w:t>
-      </w:r>
-    </w:p>
-    <w:p>
       <w:pPr>
         <w:pStyle w:val="Heading1"/>
       </w:pPr>
-      <w:bookmarkStart w:id="9" w:name="_b9fuoaumw500" w:colFirst="0" w:colLast="0"/>
+      <w:bookmarkStart w:id="8" w:name="_b9fuoaumw500" w:colFirst="0" w:colLast="0"/>
+      <w:bookmarkEnd w:id="8"/>
+    </w:p>
+    <w:p/>
+    <w:p>
+      <w:pPr>
+        <w:pStyle w:val="Heading1"/>
+      </w:pPr>
+      <w:r>
+        <w:lastRenderedPageBreak/>
+        <w:t>3. Stakeholder and User Descriptions</w:t>
+      </w:r>
+    </w:p>
+    <w:p>
+      <w:pPr>
+        <w:pStyle w:val="Heading2"/>
+      </w:pPr>
+      <w:bookmarkStart w:id="9" w:name="_kacqszm0rg4u" w:colFirst="0" w:colLast="0"/>
       <w:bookmarkEnd w:id="9"/>
       <w:r>
-        <w:t>3. Stakeholder and User Descriptions</w:t>
-      </w:r>
-    </w:p>
-    <w:p>
-      <w:r>
-        <w:t xml:space="preserve">[To effectively provide products and services that meet your stakeholders' and users' real needs, it is necessary to identify and involve all of the stakeholders as part of the Requirements Modeling process. You must also identify the users of the system and ensure </w:t>
-      </w:r>
-      <w:r>
-        <w:lastRenderedPageBreak/>
-        <w:t>that the stakeholder community adequately represents them. This section provides a profile of the stakeholders and users involved in the project, and the key problems that they perceive to be addressed by the proposed solution. It does not describe their specific requests or requirements as these are captured in a separate stakeholder requests artifact. Instead, it provides the background and justification for why the requirements are needed.]</w:t>
-      </w:r>
-    </w:p>
-    <w:p/>
-    <w:p>
-      <w:pPr>
-        <w:pStyle w:val="Heading2"/>
-      </w:pPr>
-      <w:bookmarkStart w:id="10" w:name="_kacqszm0rg4u" w:colFirst="0" w:colLast="0"/>
-      <w:bookmarkEnd w:id="10"/>
-      <w:r>
         <w:t>3.1 Stakeholder Summary</w:t>
       </w:r>
     </w:p>
-    <w:p>
-      <w:r>
-        <w:t>[There are a number of stakeholders with an interest in the development and not all of them are end users. Present a summary list of these non-user stakeholders. (The users are summarized in section 3.2.)]</w:t>
-      </w:r>
-    </w:p>
-    <w:p/>
     <w:tbl>
       <w:tblPr>
         <w:tblStyle w:val="a2"/>
         <w:tblW w:w="8940" w:type="dxa"/>
         <w:tblInd w:w="0" w:type="dxa"/>
         <w:tblBorders>
-          <w:top w:val="nil"/>
-          <w:left w:val="nil"/>
-          <w:bottom w:val="nil"/>
-          <w:right w:val="nil"/>
-          <w:insideH w:val="nil"/>
-          <w:insideV w:val="nil"/>
+          <w:top w:val="single" w:sz="4" w:space="0" w:color="auto"/>
+          <w:left w:val="single" w:sz="4" w:space="0" w:color="auto"/>
+          <w:bottom w:val="single" w:sz="4" w:space="0" w:color="auto"/>
+          <w:right w:val="single" w:sz="4" w:space="0" w:color="auto"/>
+          <w:insideH w:val="single" w:sz="4" w:space="0" w:color="auto"/>
+          <w:insideV w:val="single" w:sz="4" w:space="0" w:color="auto"/>
         </w:tblBorders>
         <w:tblLayout w:type="fixed"/>
         <w:tblLook w:val="0600" w:firstRow="0" w:lastRow="0" w:firstColumn="0" w:lastColumn="0" w:noHBand="1" w:noVBand="1"/>
@@ -2361,12 +2605,6 @@
         <w:tc>
           <w:tcPr>
             <w:tcW w:w="2670" w:type="dxa"/>
-            <w:tcBorders>
-              <w:top w:val="single" w:sz="5" w:space="0" w:color="000000"/>
-              <w:left w:val="single" w:sz="5" w:space="0" w:color="000000"/>
-              <w:bottom w:val="single" w:sz="5" w:space="0" w:color="000000"/>
-              <w:right w:val="single" w:sz="5" w:space="0" w:color="000000"/>
-            </w:tcBorders>
             <w:shd w:val="clear" w:color="auto" w:fill="BFBFBF"/>
             <w:tcMar>
               <w:top w:w="0" w:type="dxa"/>
@@ -2387,12 +2625,6 @@
         <w:tc>
           <w:tcPr>
             <w:tcW w:w="3015" w:type="dxa"/>
-            <w:tcBorders>
-              <w:top w:val="single" w:sz="5" w:space="0" w:color="000000"/>
-              <w:left w:val="nil"/>
-              <w:bottom w:val="single" w:sz="5" w:space="0" w:color="000000"/>
-              <w:right w:val="single" w:sz="5" w:space="0" w:color="000000"/>
-            </w:tcBorders>
             <w:shd w:val="clear" w:color="auto" w:fill="BFBFBF"/>
             <w:tcMar>
               <w:top w:w="0" w:type="dxa"/>
@@ -2413,12 +2645,6 @@
         <w:tc>
           <w:tcPr>
             <w:tcW w:w="3255" w:type="dxa"/>
-            <w:tcBorders>
-              <w:top w:val="single" w:sz="5" w:space="0" w:color="000000"/>
-              <w:left w:val="nil"/>
-              <w:bottom w:val="single" w:sz="5" w:space="0" w:color="000000"/>
-              <w:right w:val="single" w:sz="5" w:space="0" w:color="000000"/>
-            </w:tcBorders>
             <w:shd w:val="clear" w:color="auto" w:fill="BFBFBF"/>
             <w:tcMar>
               <w:top w:w="0" w:type="dxa"/>
@@ -2439,17 +2665,11 @@
       </w:tr>
       <w:tr>
         <w:trPr>
-          <w:trHeight w:val="4593"/>
+          <w:trHeight w:val="2553"/>
         </w:trPr>
         <w:tc>
           <w:tcPr>
             <w:tcW w:w="2670" w:type="dxa"/>
-            <w:tcBorders>
-              <w:top w:val="nil"/>
-              <w:left w:val="single" w:sz="5" w:space="0" w:color="000000"/>
-              <w:bottom w:val="single" w:sz="5" w:space="0" w:color="000000"/>
-              <w:right w:val="single" w:sz="5" w:space="0" w:color="000000"/>
-            </w:tcBorders>
             <w:tcMar>
               <w:top w:w="0" w:type="dxa"/>
               <w:left w:w="100" w:type="dxa"/>
@@ -2460,21 +2680,23 @@
           <w:p>
             <w:pPr>
               <w:spacing w:line="240" w:lineRule="auto"/>
-            </w:pPr>
-            <w:r>
-              <w:t>[Name the stakeholder type.]</w:t>
+              <w:rPr>
+                <w:b/>
+                <w:bCs/>
+              </w:rPr>
+            </w:pPr>
+            <w:r>
+              <w:rPr>
+                <w:b/>
+                <w:bCs/>
+              </w:rPr>
+              <w:t>Project Sponsor / Product Owner</w:t>
             </w:r>
           </w:p>
         </w:tc>
         <w:tc>
           <w:tcPr>
             <w:tcW w:w="3015" w:type="dxa"/>
-            <w:tcBorders>
-              <w:top w:val="nil"/>
-              <w:left w:val="nil"/>
-              <w:bottom w:val="single" w:sz="5" w:space="0" w:color="000000"/>
-              <w:right w:val="single" w:sz="5" w:space="0" w:color="000000"/>
-            </w:tcBorders>
             <w:tcMar>
               <w:top w:w="0" w:type="dxa"/>
               <w:left w:w="100" w:type="dxa"/>
@@ -2487,19 +2709,13 @@
               <w:spacing w:line="240" w:lineRule="auto"/>
             </w:pPr>
             <w:r>
-              <w:t>[Briefly describe the stakeholder.]</w:t>
+              <w:t>The primary authority and visionary behind ChattyBot.</w:t>
             </w:r>
           </w:p>
         </w:tc>
         <w:tc>
           <w:tcPr>
             <w:tcW w:w="3255" w:type="dxa"/>
-            <w:tcBorders>
-              <w:top w:val="nil"/>
-              <w:left w:val="nil"/>
-              <w:bottom w:val="single" w:sz="5" w:space="0" w:color="000000"/>
-              <w:right w:val="single" w:sz="5" w:space="0" w:color="000000"/>
-            </w:tcBorders>
             <w:tcMar>
               <w:top w:w="0" w:type="dxa"/>
               <w:left w:w="100" w:type="dxa"/>
@@ -2509,50 +2725,435 @@
           </w:tcPr>
           <w:p>
             <w:pPr>
+              <w:spacing w:after="120" w:line="240" w:lineRule="auto"/>
+            </w:pPr>
+            <w:r>
+              <w:t>• Approves funding and resource allocation.</w:t>
+            </w:r>
+          </w:p>
+          <w:p>
+            <w:pPr>
+              <w:spacing w:after="120" w:line="240" w:lineRule="auto"/>
+            </w:pPr>
+            <w:r>
+              <w:t>• Ensures market demand by validating the need for a privacy-focused, lightweight assistant.</w:t>
+            </w:r>
+          </w:p>
+          <w:p>
+            <w:pPr>
+              <w:spacing w:after="120" w:line="240" w:lineRule="auto"/>
+            </w:pPr>
+            <w:r>
+              <w:t>• Provides final sign-off on high-level features and project goals.</w:t>
+            </w:r>
+          </w:p>
+        </w:tc>
+      </w:tr>
+      <w:tr>
+        <w:trPr>
+          <w:trHeight w:val="841"/>
+        </w:trPr>
+        <w:tc>
+          <w:tcPr>
+            <w:tcW w:w="2670" w:type="dxa"/>
+            <w:tcMar>
+              <w:top w:w="0" w:type="dxa"/>
+              <w:left w:w="100" w:type="dxa"/>
+              <w:bottom w:w="0" w:type="dxa"/>
+              <w:right w:w="100" w:type="dxa"/>
+            </w:tcMar>
+          </w:tcPr>
+          <w:p>
+            <w:pPr>
               <w:spacing w:line="240" w:lineRule="auto"/>
-            </w:pPr>
-            <w:r>
-              <w:t>[Summarize the stakeholder's key responsibilities with regard to the system being developed; that is, their interest as a stakeholder. For example, this stakeholder:</w:t>
-            </w:r>
-          </w:p>
+              <w:rPr>
+                <w:b/>
+                <w:bCs/>
+              </w:rPr>
+            </w:pPr>
+            <w:r>
+              <w:rPr>
+                <w:b/>
+                <w:bCs/>
+              </w:rPr>
+              <w:t>Project Manager / Supervisor</w:t>
+            </w:r>
+          </w:p>
+        </w:tc>
+        <w:tc>
+          <w:tcPr>
+            <w:tcW w:w="3015" w:type="dxa"/>
+            <w:tcMar>
+              <w:top w:w="0" w:type="dxa"/>
+              <w:left w:w="100" w:type="dxa"/>
+              <w:bottom w:w="0" w:type="dxa"/>
+              <w:right w:w="100" w:type="dxa"/>
+            </w:tcMar>
+          </w:tcPr>
           <w:p>
             <w:pPr>
               <w:spacing w:line="240" w:lineRule="auto"/>
             </w:pPr>
             <w:r>
-              <w:t>- ensures that the system will be maintainable</w:t>
-            </w:r>
-          </w:p>
+              <w:t>The individual responsible for the project's delivery and oversight.</w:t>
+            </w:r>
+          </w:p>
+        </w:tc>
+        <w:tc>
+          <w:tcPr>
+            <w:tcW w:w="3255" w:type="dxa"/>
+            <w:tcMar>
+              <w:top w:w="0" w:type="dxa"/>
+              <w:left w:w="100" w:type="dxa"/>
+              <w:bottom w:w="0" w:type="dxa"/>
+              <w:right w:w="100" w:type="dxa"/>
+            </w:tcMar>
+          </w:tcPr>
+          <w:p>
+            <w:pPr>
+              <w:spacing w:after="120" w:line="240" w:lineRule="auto"/>
+              <w:rPr>
+                <w:lang w:val="en-US"/>
+              </w:rPr>
+            </w:pPr>
+            <w:r>
+              <w:rPr>
+                <w:lang w:val="en-US"/>
+              </w:rPr>
+              <w:t>• Monitors the project's progress to ensure milestones are met.</w:t>
+            </w:r>
+          </w:p>
+          <w:p>
+            <w:pPr>
+              <w:spacing w:after="120" w:line="240" w:lineRule="auto"/>
+              <w:rPr>
+                <w:lang w:val="en-US"/>
+              </w:rPr>
+            </w:pPr>
+            <w:r>
+              <w:rPr>
+                <w:lang w:val="en-US"/>
+              </w:rPr>
+              <w:t>• Manages the project scope and ensures the Vision document is followed</w:t>
+            </w:r>
+          </w:p>
+          <w:p>
+            <w:pPr>
+              <w:spacing w:after="120" w:line="240" w:lineRule="auto"/>
+              <w:rPr>
+                <w:lang w:val="en-US"/>
+              </w:rPr>
+            </w:pPr>
+            <w:r>
+              <w:rPr>
+                <w:lang w:val="en-US"/>
+              </w:rPr>
+              <w:t>• Acts as the main point of contact between stakeholders and the technical team.</w:t>
+            </w:r>
+          </w:p>
+        </w:tc>
+      </w:tr>
+      <w:tr>
+        <w:trPr>
+          <w:trHeight w:val="851"/>
+        </w:trPr>
+        <w:tc>
+          <w:tcPr>
+            <w:tcW w:w="2670" w:type="dxa"/>
+            <w:tcMar>
+              <w:top w:w="0" w:type="dxa"/>
+              <w:left w:w="100" w:type="dxa"/>
+              <w:bottom w:w="0" w:type="dxa"/>
+              <w:right w:w="100" w:type="dxa"/>
+            </w:tcMar>
+          </w:tcPr>
           <w:p>
             <w:pPr>
               <w:spacing w:line="240" w:lineRule="auto"/>
-            </w:pPr>
-            <w:r>
-              <w:t>- ensures that there will be a market demand for the product's features</w:t>
-            </w:r>
-          </w:p>
+              <w:rPr>
+                <w:b/>
+                <w:bCs/>
+              </w:rPr>
+            </w:pPr>
+            <w:r>
+              <w:rPr>
+                <w:b/>
+                <w:bCs/>
+              </w:rPr>
+              <w:t>Lead Developer / Architect</w:t>
+            </w:r>
+          </w:p>
+        </w:tc>
+        <w:tc>
+          <w:tcPr>
+            <w:tcW w:w="3015" w:type="dxa"/>
+            <w:tcMar>
+              <w:top w:w="0" w:type="dxa"/>
+              <w:left w:w="100" w:type="dxa"/>
+              <w:bottom w:w="0" w:type="dxa"/>
+              <w:right w:w="100" w:type="dxa"/>
+            </w:tcMar>
+          </w:tcPr>
           <w:p>
             <w:pPr>
               <w:spacing w:line="240" w:lineRule="auto"/>
             </w:pPr>
             <w:r>
-              <w:t xml:space="preserve">- monitors the project's progress </w:t>
-            </w:r>
-          </w:p>
+              <w:t>The technical lead responsible for the application's build and logic.</w:t>
+            </w:r>
+          </w:p>
+        </w:tc>
+        <w:tc>
+          <w:tcPr>
+            <w:tcW w:w="3255" w:type="dxa"/>
+            <w:tcMar>
+              <w:top w:w="0" w:type="dxa"/>
+              <w:left w:w="100" w:type="dxa"/>
+              <w:bottom w:w="0" w:type="dxa"/>
+              <w:right w:w="100" w:type="dxa"/>
+            </w:tcMar>
+          </w:tcPr>
+          <w:p>
+            <w:pPr>
+              <w:spacing w:after="120" w:line="240" w:lineRule="auto"/>
+              <w:rPr>
+                <w:lang w:val="en-US"/>
+              </w:rPr>
+            </w:pPr>
+            <w:r>
+              <w:rPr>
+                <w:lang w:val="en-US"/>
+              </w:rPr>
+              <w:t>• Ensures the system is maintainable, scalable, and follows clean code standards.</w:t>
+            </w:r>
+          </w:p>
+          <w:p>
+            <w:pPr>
+              <w:spacing w:after="120" w:line="240" w:lineRule="auto"/>
+              <w:rPr>
+                <w:lang w:val="en-US"/>
+              </w:rPr>
+            </w:pPr>
+            <w:r>
+              <w:rPr>
+                <w:lang w:val="en-US"/>
+              </w:rPr>
+              <w:t>• Designs the client-server architecture and rule-based bot logic</w:t>
+            </w:r>
+          </w:p>
+          <w:p>
+            <w:pPr>
+              <w:spacing w:after="120" w:line="240" w:lineRule="auto"/>
+              <w:rPr>
+                <w:lang w:val="en-US"/>
+              </w:rPr>
+            </w:pPr>
+            <w:r>
+              <w:rPr>
+                <w:lang w:val="en-US"/>
+              </w:rPr>
+              <w:t>• Responsible for the overall technical integrity and performance of ChattyBot.</w:t>
+            </w:r>
+          </w:p>
+        </w:tc>
+      </w:tr>
+      <w:tr>
+        <w:trPr>
+          <w:trHeight w:val="851"/>
+        </w:trPr>
+        <w:tc>
+          <w:tcPr>
+            <w:tcW w:w="2670" w:type="dxa"/>
+            <w:tcMar>
+              <w:top w:w="0" w:type="dxa"/>
+              <w:left w:w="100" w:type="dxa"/>
+              <w:bottom w:w="0" w:type="dxa"/>
+              <w:right w:w="100" w:type="dxa"/>
+            </w:tcMar>
+          </w:tcPr>
           <w:p>
             <w:pPr>
               <w:spacing w:line="240" w:lineRule="auto"/>
-            </w:pPr>
-            <w:r>
-              <w:t>- approves funding</w:t>
-            </w:r>
-          </w:p>
+              <w:rPr>
+                <w:b/>
+                <w:bCs/>
+              </w:rPr>
+            </w:pPr>
+            <w:r>
+              <w:rPr>
+                <w:b/>
+                <w:bCs/>
+              </w:rPr>
+              <w:t>System Administrator</w:t>
+            </w:r>
+          </w:p>
+        </w:tc>
+        <w:tc>
+          <w:tcPr>
+            <w:tcW w:w="3015" w:type="dxa"/>
+            <w:tcMar>
+              <w:top w:w="0" w:type="dxa"/>
+              <w:left w:w="100" w:type="dxa"/>
+              <w:bottom w:w="0" w:type="dxa"/>
+              <w:right w:w="100" w:type="dxa"/>
+            </w:tcMar>
+          </w:tcPr>
           <w:p>
             <w:pPr>
               <w:spacing w:line="240" w:lineRule="auto"/>
             </w:pPr>
             <w:r>
-              <w:t>- and so forth]</w:t>
+              <w:t>The person responsible for the backend infrastructure and live environment.</w:t>
+            </w:r>
+          </w:p>
+        </w:tc>
+        <w:tc>
+          <w:tcPr>
+            <w:tcW w:w="3255" w:type="dxa"/>
+            <w:tcMar>
+              <w:top w:w="0" w:type="dxa"/>
+              <w:left w:w="100" w:type="dxa"/>
+              <w:bottom w:w="0" w:type="dxa"/>
+              <w:right w:w="100" w:type="dxa"/>
+            </w:tcMar>
+          </w:tcPr>
+          <w:p>
+            <w:pPr>
+              <w:spacing w:after="120" w:line="240" w:lineRule="auto"/>
+              <w:rPr>
+                <w:lang w:val="en-US"/>
+              </w:rPr>
+            </w:pPr>
+            <w:r>
+              <w:rPr>
+                <w:lang w:val="en-US"/>
+              </w:rPr>
+              <w:t>• Manages the centralized database and ensures consistent data persistence.</w:t>
+            </w:r>
+          </w:p>
+          <w:p>
+            <w:pPr>
+              <w:spacing w:after="120" w:line="240" w:lineRule="auto"/>
+              <w:rPr>
+                <w:lang w:val="en-US"/>
+              </w:rPr>
+            </w:pPr>
+            <w:r>
+              <w:rPr>
+                <w:lang w:val="en-US"/>
+              </w:rPr>
+              <w:t>• Monitors server uptime and ensures the JSON/XML export functionality is reliable.</w:t>
+            </w:r>
+          </w:p>
+          <w:p>
+            <w:pPr>
+              <w:spacing w:after="120" w:line="240" w:lineRule="auto"/>
+              <w:rPr>
+                <w:lang w:val="en-US"/>
+              </w:rPr>
+            </w:pPr>
+            <w:r>
+              <w:rPr>
+                <w:lang w:val="en-US"/>
+              </w:rPr>
+              <w:t>• Implements server-side security protocols to protect stored profiles.</w:t>
+            </w:r>
+          </w:p>
+        </w:tc>
+      </w:tr>
+      <w:tr>
+        <w:trPr>
+          <w:trHeight w:val="851"/>
+        </w:trPr>
+        <w:tc>
+          <w:tcPr>
+            <w:tcW w:w="2670" w:type="dxa"/>
+            <w:tcMar>
+              <w:top w:w="0" w:type="dxa"/>
+              <w:left w:w="100" w:type="dxa"/>
+              <w:bottom w:w="0" w:type="dxa"/>
+              <w:right w:w="100" w:type="dxa"/>
+            </w:tcMar>
+          </w:tcPr>
+          <w:p>
+            <w:pPr>
+              <w:spacing w:line="240" w:lineRule="auto"/>
+              <w:rPr>
+                <w:b/>
+                <w:bCs/>
+              </w:rPr>
+            </w:pPr>
+            <w:r>
+              <w:rPr>
+                <w:b/>
+                <w:bCs/>
+              </w:rPr>
+              <w:t>Privacy &amp; Compliance Officer</w:t>
+            </w:r>
+          </w:p>
+        </w:tc>
+        <w:tc>
+          <w:tcPr>
+            <w:tcW w:w="3015" w:type="dxa"/>
+            <w:tcMar>
+              <w:top w:w="0" w:type="dxa"/>
+              <w:left w:w="100" w:type="dxa"/>
+              <w:bottom w:w="0" w:type="dxa"/>
+              <w:right w:w="100" w:type="dxa"/>
+            </w:tcMar>
+          </w:tcPr>
+          <w:p>
+            <w:pPr>
+              <w:spacing w:line="240" w:lineRule="auto"/>
+            </w:pPr>
+            <w:r>
+              <w:t>The stakeholder focused on the product’s core promise: data ownership.</w:t>
+            </w:r>
+          </w:p>
+        </w:tc>
+        <w:tc>
+          <w:tcPr>
+            <w:tcW w:w="3255" w:type="dxa"/>
+            <w:tcMar>
+              <w:top w:w="0" w:type="dxa"/>
+              <w:left w:w="100" w:type="dxa"/>
+              <w:bottom w:w="0" w:type="dxa"/>
+              <w:right w:w="100" w:type="dxa"/>
+            </w:tcMar>
+          </w:tcPr>
+          <w:p>
+            <w:pPr>
+              <w:spacing w:after="120" w:line="240" w:lineRule="auto"/>
+              <w:rPr>
+                <w:lang w:val="en-US"/>
+              </w:rPr>
+            </w:pPr>
+            <w:r>
+              <w:rPr>
+                <w:lang w:val="en-US"/>
+              </w:rPr>
+              <w:t>• Verifies that the system respects user privacy and doesn't track unauthorized data.</w:t>
+            </w:r>
+          </w:p>
+          <w:p>
+            <w:pPr>
+              <w:spacing w:after="120" w:line="240" w:lineRule="auto"/>
+              <w:rPr>
+                <w:lang w:val="en-US"/>
+              </w:rPr>
+            </w:pPr>
+            <w:r>
+              <w:rPr>
+                <w:lang w:val="en-US"/>
+              </w:rPr>
+              <w:t xml:space="preserve">• Ensures that the exported data (JSON/XML) is complete </w:t>
+            </w:r>
+            <w:r>
+              <w:rPr>
+                <w:lang w:val="en-US"/>
+              </w:rPr>
+              <w:lastRenderedPageBreak/>
+              <w:t>and reflects true data portability.</w:t>
             </w:r>
           </w:p>
         </w:tc>
@@ -2563,38 +3164,34 @@
       <w:pPr>
         <w:pStyle w:val="Heading2"/>
       </w:pPr>
-      <w:bookmarkStart w:id="11" w:name="_bjfxvju20xz3" w:colFirst="0" w:colLast="0"/>
-      <w:bookmarkEnd w:id="11"/>
+      <w:bookmarkStart w:id="10" w:name="_bjfxvju20xz3" w:colFirst="0" w:colLast="0"/>
+      <w:bookmarkEnd w:id="10"/>
       <w:r>
         <w:t>3.2 User Summary</w:t>
       </w:r>
     </w:p>
-    <w:p>
-      <w:r>
-        <w:t>[Present a summary list of all identified users.]</w:t>
-      </w:r>
-    </w:p>
+    <w:p/>
     <w:tbl>
       <w:tblPr>
         <w:tblStyle w:val="a3"/>
-        <w:tblW w:w="9025" w:type="dxa"/>
+        <w:tblW w:w="9775" w:type="dxa"/>
         <w:tblInd w:w="0" w:type="dxa"/>
         <w:tblBorders>
-          <w:top w:val="nil"/>
-          <w:left w:val="nil"/>
-          <w:bottom w:val="nil"/>
-          <w:right w:val="nil"/>
-          <w:insideH w:val="nil"/>
-          <w:insideV w:val="nil"/>
+          <w:top w:val="single" w:sz="4" w:space="0" w:color="auto"/>
+          <w:left w:val="single" w:sz="4" w:space="0" w:color="auto"/>
+          <w:bottom w:val="single" w:sz="4" w:space="0" w:color="auto"/>
+          <w:right w:val="single" w:sz="4" w:space="0" w:color="auto"/>
+          <w:insideH w:val="single" w:sz="4" w:space="0" w:color="auto"/>
+          <w:insideV w:val="single" w:sz="4" w:space="0" w:color="auto"/>
         </w:tblBorders>
         <w:tblLayout w:type="fixed"/>
         <w:tblLook w:val="0600" w:firstRow="0" w:lastRow="0" w:firstColumn="0" w:lastColumn="0" w:noHBand="1" w:noVBand="1"/>
       </w:tblPr>
       <w:tblGrid>
-        <w:gridCol w:w="1300"/>
-        <w:gridCol w:w="1583"/>
-        <w:gridCol w:w="3213"/>
-        <w:gridCol w:w="2929"/>
+        <w:gridCol w:w="1695"/>
+        <w:gridCol w:w="1560"/>
+        <w:gridCol w:w="2841"/>
+        <w:gridCol w:w="3679"/>
       </w:tblGrid>
       <w:tr>
         <w:trPr>
@@ -2602,13 +3199,7 @@
         </w:trPr>
         <w:tc>
           <w:tcPr>
-            <w:tcW w:w="1300" w:type="dxa"/>
-            <w:tcBorders>
-              <w:top w:val="single" w:sz="5" w:space="0" w:color="000000"/>
-              <w:left w:val="single" w:sz="5" w:space="0" w:color="000000"/>
-              <w:bottom w:val="single" w:sz="5" w:space="0" w:color="000000"/>
-              <w:right w:val="single" w:sz="5" w:space="0" w:color="000000"/>
-            </w:tcBorders>
+            <w:tcW w:w="1695" w:type="dxa"/>
             <w:shd w:val="clear" w:color="auto" w:fill="BFBFBF"/>
             <w:tcMar>
               <w:top w:w="0" w:type="dxa"/>
@@ -2628,13 +3219,7 @@
         </w:tc>
         <w:tc>
           <w:tcPr>
-            <w:tcW w:w="1583" w:type="dxa"/>
-            <w:tcBorders>
-              <w:top w:val="single" w:sz="5" w:space="0" w:color="000000"/>
-              <w:left w:val="nil"/>
-              <w:bottom w:val="single" w:sz="5" w:space="0" w:color="000000"/>
-              <w:right w:val="single" w:sz="5" w:space="0" w:color="000000"/>
-            </w:tcBorders>
+            <w:tcW w:w="1560" w:type="dxa"/>
             <w:shd w:val="clear" w:color="auto" w:fill="BFBFBF"/>
             <w:tcMar>
               <w:top w:w="0" w:type="dxa"/>
@@ -2654,13 +3239,7 @@
         </w:tc>
         <w:tc>
           <w:tcPr>
-            <w:tcW w:w="3212" w:type="dxa"/>
-            <w:tcBorders>
-              <w:top w:val="single" w:sz="5" w:space="0" w:color="000000"/>
-              <w:left w:val="nil"/>
-              <w:bottom w:val="single" w:sz="5" w:space="0" w:color="000000"/>
-              <w:right w:val="single" w:sz="5" w:space="0" w:color="000000"/>
-            </w:tcBorders>
+            <w:tcW w:w="2841" w:type="dxa"/>
             <w:shd w:val="clear" w:color="auto" w:fill="BFBFBF"/>
             <w:tcMar>
               <w:top w:w="0" w:type="dxa"/>
@@ -2680,13 +3259,7 @@
         </w:tc>
         <w:tc>
           <w:tcPr>
-            <w:tcW w:w="2928" w:type="dxa"/>
-            <w:tcBorders>
-              <w:top w:val="single" w:sz="5" w:space="0" w:color="000000"/>
-              <w:left w:val="nil"/>
-              <w:bottom w:val="single" w:sz="5" w:space="0" w:color="000000"/>
-              <w:right w:val="single" w:sz="5" w:space="0" w:color="000000"/>
-            </w:tcBorders>
+            <w:tcW w:w="3679" w:type="dxa"/>
             <w:shd w:val="clear" w:color="auto" w:fill="BFBFBF"/>
             <w:tcMar>
               <w:top w:w="0" w:type="dxa"/>
@@ -2707,17 +3280,11 @@
       </w:tr>
       <w:tr>
         <w:trPr>
-          <w:trHeight w:val="3180"/>
+          <w:trHeight w:val="1839"/>
         </w:trPr>
         <w:tc>
           <w:tcPr>
-            <w:tcW w:w="1300" w:type="dxa"/>
-            <w:tcBorders>
-              <w:top w:val="nil"/>
-              <w:left w:val="single" w:sz="5" w:space="0" w:color="000000"/>
-              <w:bottom w:val="single" w:sz="5" w:space="0" w:color="000000"/>
-              <w:right w:val="single" w:sz="5" w:space="0" w:color="000000"/>
-            </w:tcBorders>
+            <w:tcW w:w="1695" w:type="dxa"/>
             <w:tcMar>
               <w:top w:w="0" w:type="dxa"/>
               <w:left w:w="100" w:type="dxa"/>
@@ -2728,21 +3295,23 @@
           <w:p>
             <w:pPr>
               <w:spacing w:line="240" w:lineRule="auto"/>
-            </w:pPr>
-            <w:r>
-              <w:t>[Name the user type.]</w:t>
-            </w:r>
-          </w:p>
-        </w:tc>
-        <w:tc>
-          <w:tcPr>
-            <w:tcW w:w="1583" w:type="dxa"/>
-            <w:tcBorders>
-              <w:top w:val="nil"/>
-              <w:left w:val="nil"/>
-              <w:bottom w:val="single" w:sz="5" w:space="0" w:color="000000"/>
-              <w:right w:val="single" w:sz="5" w:space="0" w:color="000000"/>
-            </w:tcBorders>
+              <w:rPr>
+                <w:b/>
+                <w:bCs/>
+              </w:rPr>
+            </w:pPr>
+            <w:r>
+              <w:rPr>
+                <w:b/>
+                <w:bCs/>
+              </w:rPr>
+              <w:t>End User</w:t>
+            </w:r>
+          </w:p>
+        </w:tc>
+        <w:tc>
+          <w:tcPr>
+            <w:tcW w:w="1560" w:type="dxa"/>
             <w:tcMar>
               <w:top w:w="0" w:type="dxa"/>
               <w:left w:w="100" w:type="dxa"/>
@@ -2755,19 +3324,19 @@
               <w:spacing w:line="240" w:lineRule="auto"/>
             </w:pPr>
             <w:r>
-              <w:t>[Briefly describe what they represent with respect to the system.]</w:t>
-            </w:r>
-          </w:p>
-        </w:tc>
-        <w:tc>
-          <w:tcPr>
-            <w:tcW w:w="3212" w:type="dxa"/>
-            <w:tcBorders>
-              <w:top w:val="nil"/>
-              <w:left w:val="nil"/>
-              <w:bottom w:val="single" w:sz="5" w:space="0" w:color="000000"/>
-              <w:right w:val="single" w:sz="5" w:space="0" w:color="000000"/>
-            </w:tcBorders>
+              <w:t xml:space="preserve">The primary user who interacts with ChattyBot for daily </w:t>
+            </w:r>
+            <w:r>
+              <w:t>tasks</w:t>
+            </w:r>
+            <w:r>
+              <w:t>.</w:t>
+            </w:r>
+          </w:p>
+        </w:tc>
+        <w:tc>
+          <w:tcPr>
+            <w:tcW w:w="2841" w:type="dxa"/>
             <w:tcMar>
               <w:top w:w="0" w:type="dxa"/>
               <w:left w:w="100" w:type="dxa"/>
@@ -2777,54 +3346,189 @@
           </w:tcPr>
           <w:p>
             <w:pPr>
+              <w:spacing w:after="120" w:line="240" w:lineRule="auto"/>
+            </w:pPr>
+            <w:r>
+              <w:t>• Captures details by sending text messages and updating profile info.</w:t>
+            </w:r>
+          </w:p>
+          <w:p>
+            <w:pPr>
+              <w:spacing w:after="120" w:line="240" w:lineRule="auto"/>
+            </w:pPr>
+            <w:r>
+              <w:t>• Issues predefined bot commands</w:t>
+            </w:r>
+            <w:r>
+              <w:t>.</w:t>
+            </w:r>
+            <w:r>
+              <w:t xml:space="preserve"> (/help, /time, /joke)</w:t>
+            </w:r>
+          </w:p>
+          <w:p>
+            <w:pPr>
+              <w:spacing w:after="120" w:line="240" w:lineRule="auto"/>
+            </w:pPr>
+            <w:r>
+              <w:t>• Views chat history retrieved from the server.</w:t>
+            </w:r>
+          </w:p>
+        </w:tc>
+        <w:tc>
+          <w:tcPr>
+            <w:tcW w:w="3679" w:type="dxa"/>
+            <w:tcMar>
+              <w:top w:w="0" w:type="dxa"/>
+              <w:left w:w="100" w:type="dxa"/>
+              <w:bottom w:w="0" w:type="dxa"/>
+              <w:right w:w="100" w:type="dxa"/>
+            </w:tcMar>
+          </w:tcPr>
+          <w:p>
+            <w:pPr>
               <w:spacing w:line="240" w:lineRule="auto"/>
             </w:pPr>
             <w:r>
-              <w:t>[List the user's key responsibilities with regard to the system being developed; for example:</w:t>
-            </w:r>
-          </w:p>
+              <w:t>Project Sponsor (ensures a pleasant user experience and high satisfaction).</w:t>
+            </w:r>
+          </w:p>
+        </w:tc>
+      </w:tr>
+      <w:tr>
+        <w:trPr>
+          <w:trHeight w:val="1554"/>
+        </w:trPr>
+        <w:tc>
+          <w:tcPr>
+            <w:tcW w:w="1695" w:type="dxa"/>
+            <w:tcMar>
+              <w:top w:w="0" w:type="dxa"/>
+              <w:left w:w="100" w:type="dxa"/>
+              <w:bottom w:w="0" w:type="dxa"/>
+              <w:right w:w="100" w:type="dxa"/>
+            </w:tcMar>
+          </w:tcPr>
           <w:p>
             <w:pPr>
               <w:spacing w:line="240" w:lineRule="auto"/>
-            </w:pPr>
-            <w:r>
-              <w:t>- captures details</w:t>
-            </w:r>
-          </w:p>
+              <w:rPr>
+                <w:b/>
+                <w:bCs/>
+              </w:rPr>
+            </w:pPr>
+            <w:r>
+              <w:rPr>
+                <w:b/>
+                <w:bCs/>
+              </w:rPr>
+              <w:t>Data Archivist</w:t>
+            </w:r>
+          </w:p>
+        </w:tc>
+        <w:tc>
+          <w:tcPr>
+            <w:tcW w:w="1560" w:type="dxa"/>
+            <w:tcMar>
+              <w:top w:w="0" w:type="dxa"/>
+              <w:left w:w="100" w:type="dxa"/>
+              <w:bottom w:w="0" w:type="dxa"/>
+              <w:right w:w="100" w:type="dxa"/>
+            </w:tcMar>
+          </w:tcPr>
           <w:p>
             <w:pPr>
               <w:spacing w:line="240" w:lineRule="auto"/>
             </w:pPr>
             <w:r>
-              <w:t>- produces reports</w:t>
-            </w:r>
-          </w:p>
+              <w:t>A user role focused on exercising their right to data ownership.</w:t>
+            </w:r>
+          </w:p>
+        </w:tc>
+        <w:tc>
+          <w:tcPr>
+            <w:tcW w:w="2841" w:type="dxa"/>
+            <w:tcMar>
+              <w:top w:w="0" w:type="dxa"/>
+              <w:left w:w="100" w:type="dxa"/>
+              <w:bottom w:w="0" w:type="dxa"/>
+              <w:right w:w="100" w:type="dxa"/>
+            </w:tcMar>
+          </w:tcPr>
+          <w:p>
+            <w:pPr>
+              <w:spacing w:after="120" w:line="240" w:lineRule="auto"/>
+            </w:pPr>
+            <w:r>
+              <w:t>• Produces reports by requesting chat log exports from the server</w:t>
+            </w:r>
+            <w:r>
+              <w:t>.</w:t>
+            </w:r>
+          </w:p>
+          <w:p>
+            <w:pPr>
+              <w:spacing w:after="120" w:line="240" w:lineRule="auto"/>
+            </w:pPr>
+            <w:r>
+              <w:t>• Manages personal archives in JSON or XML formats.</w:t>
+            </w:r>
+          </w:p>
+        </w:tc>
+        <w:tc>
+          <w:tcPr>
+            <w:tcW w:w="3679" w:type="dxa"/>
+            <w:tcMar>
+              <w:top w:w="0" w:type="dxa"/>
+              <w:left w:w="100" w:type="dxa"/>
+              <w:bottom w:w="0" w:type="dxa"/>
+              <w:right w:w="100" w:type="dxa"/>
+            </w:tcMar>
+          </w:tcPr>
           <w:p>
             <w:pPr>
               <w:spacing w:line="240" w:lineRule="auto"/>
             </w:pPr>
             <w:r>
-              <w:t>- coordinates work</w:t>
-            </w:r>
-          </w:p>
+              <w:t>Privacy &amp; Compliance Officer (ensures data portability and privacy standards).</w:t>
+            </w:r>
+          </w:p>
+        </w:tc>
+      </w:tr>
+      <w:tr>
+        <w:trPr>
+          <w:trHeight w:val="1554"/>
+        </w:trPr>
+        <w:tc>
+          <w:tcPr>
+            <w:tcW w:w="1695" w:type="dxa"/>
+            <w:tcMar>
+              <w:top w:w="0" w:type="dxa"/>
+              <w:left w:w="100" w:type="dxa"/>
+              <w:bottom w:w="0" w:type="dxa"/>
+              <w:right w:w="100" w:type="dxa"/>
+            </w:tcMar>
+          </w:tcPr>
           <w:p>
             <w:pPr>
               <w:spacing w:line="240" w:lineRule="auto"/>
-            </w:pPr>
-            <w:r>
-              <w:t>- and so on]</w:t>
-            </w:r>
-          </w:p>
-        </w:tc>
-        <w:tc>
-          <w:tcPr>
-            <w:tcW w:w="2928" w:type="dxa"/>
-            <w:tcBorders>
-              <w:top w:val="nil"/>
-              <w:left w:val="nil"/>
-              <w:bottom w:val="single" w:sz="5" w:space="0" w:color="000000"/>
-              <w:right w:val="single" w:sz="5" w:space="0" w:color="000000"/>
-            </w:tcBorders>
+              <w:rPr>
+                <w:b/>
+                <w:bCs/>
+              </w:rPr>
+            </w:pPr>
+            <w:r>
+              <w:rPr>
+                <w:b/>
+                <w:bCs/>
+              </w:rPr>
+              <w:t>System Administrator</w:t>
+            </w:r>
+          </w:p>
+        </w:tc>
+        <w:tc>
+          <w:tcPr>
+            <w:tcW w:w="1560" w:type="dxa"/>
             <w:tcMar>
               <w:top w:w="0" w:type="dxa"/>
               <w:left w:w="100" w:type="dxa"/>
@@ -2837,7 +3541,53 @@
               <w:spacing w:line="240" w:lineRule="auto"/>
             </w:pPr>
             <w:r>
-              <w:t>[If the user is not directly represented, identify which stakeholder is responsible for representing the user's interests.]</w:t>
+              <w:t>The technical user who operates the server and database tools.</w:t>
+            </w:r>
+          </w:p>
+        </w:tc>
+        <w:tc>
+          <w:tcPr>
+            <w:tcW w:w="2841" w:type="dxa"/>
+            <w:tcMar>
+              <w:top w:w="0" w:type="dxa"/>
+              <w:left w:w="100" w:type="dxa"/>
+              <w:bottom w:w="0" w:type="dxa"/>
+              <w:right w:w="100" w:type="dxa"/>
+            </w:tcMar>
+          </w:tcPr>
+          <w:p>
+            <w:pPr>
+              <w:spacing w:after="120" w:line="240" w:lineRule="auto"/>
+            </w:pPr>
+            <w:r>
+              <w:t>• Coordinates work by managing the backend infrastructure.</w:t>
+            </w:r>
+          </w:p>
+          <w:p>
+            <w:pPr>
+              <w:spacing w:after="120" w:line="240" w:lineRule="auto"/>
+            </w:pPr>
+            <w:r>
+              <w:t>• Monitors server performance and ensures data persistence.</w:t>
+            </w:r>
+          </w:p>
+        </w:tc>
+        <w:tc>
+          <w:tcPr>
+            <w:tcW w:w="3679" w:type="dxa"/>
+            <w:tcMar>
+              <w:top w:w="0" w:type="dxa"/>
+              <w:left w:w="100" w:type="dxa"/>
+              <w:bottom w:w="0" w:type="dxa"/>
+              <w:right w:w="100" w:type="dxa"/>
+            </w:tcMar>
+          </w:tcPr>
+          <w:p>
+            <w:pPr>
+              <w:spacing w:line="240" w:lineRule="auto"/>
+            </w:pPr>
+            <w:r>
+              <w:t>Lead Developer / Architect (ensures the admin tools are robust and maintainable).</w:t>
             </w:r>
           </w:p>
         </w:tc>
@@ -2848,96 +3598,373 @@
       <w:pPr>
         <w:pStyle w:val="Heading2"/>
       </w:pPr>
-      <w:bookmarkStart w:id="12" w:name="_fw2ujwke3oj0" w:colFirst="0" w:colLast="0"/>
-      <w:bookmarkEnd w:id="12"/>
+      <w:bookmarkStart w:id="11" w:name="_fw2ujwke3oj0" w:colFirst="0" w:colLast="0"/>
+      <w:bookmarkEnd w:id="11"/>
+    </w:p>
+    <w:p>
+      <w:pPr>
+        <w:pStyle w:val="Heading2"/>
+      </w:pPr>
       <w:r>
         <w:t>3.3 User Environment</w:t>
       </w:r>
     </w:p>
     <w:p>
-      <w:r>
-        <w:t>[Detail the working environment of the target user. Here are some suggestions:</w:t>
-      </w:r>
-    </w:p>
-    <w:p>
-      <w:pPr>
+      <w:pPr>
+        <w:pStyle w:val="ListParagraph"/>
         <w:numPr>
           <w:ilvl w:val="0"/>
-          <w:numId w:val="1"/>
+          <w:numId w:val="4"/>
         </w:numPr>
-      </w:pPr>
-      <w:r>
-        <w:t>Number of people involved in completing the task? Is this changing?</w:t>
-      </w:r>
-    </w:p>
-    <w:p>
-      <w:pPr>
+        <w:jc w:val="both"/>
+      </w:pPr>
+      <w:r>
+        <w:rPr>
+          <w:b/>
+          <w:bCs/>
+        </w:rPr>
+        <w:t xml:space="preserve">Number of </w:t>
+      </w:r>
+      <w:r>
+        <w:rPr>
+          <w:b/>
+          <w:bCs/>
+        </w:rPr>
+        <w:t>p</w:t>
+      </w:r>
+      <w:r>
+        <w:rPr>
+          <w:b/>
+          <w:bCs/>
+        </w:rPr>
+        <w:t>eop</w:t>
+      </w:r>
+      <w:r>
+        <w:rPr>
+          <w:b/>
+          <w:bCs/>
+        </w:rPr>
+        <w:t>e i</w:t>
+      </w:r>
+      <w:r>
+        <w:rPr>
+          <w:b/>
+          <w:bCs/>
+        </w:rPr>
+        <w:t>nvolved</w:t>
+      </w:r>
+      <w:r>
+        <w:t>: The interaction is primarily one-on-one: a single user interacting with the rule-based bot. While the system can support multiple users simultaneously via the server, each chat session is private. The System Administrator monitors the backend but does not interfere with individual user sessions.</w:t>
+      </w:r>
+    </w:p>
+    <w:p>
+      <w:pPr>
+        <w:pStyle w:val="ListParagraph"/>
         <w:numPr>
           <w:ilvl w:val="0"/>
-          <w:numId w:val="1"/>
+          <w:numId w:val="4"/>
         </w:numPr>
-      </w:pPr>
-      <w:r>
-        <w:t>How long is a task cycle? Amount of time spent in each activity? Is this changing?</w:t>
-      </w:r>
-    </w:p>
-    <w:p>
-      <w:pPr>
+        <w:jc w:val="both"/>
+      </w:pPr>
+      <w:r>
+        <w:rPr>
+          <w:b/>
+          <w:bCs/>
+        </w:rPr>
+        <w:t>Task Cycle and Time Spent</w:t>
+      </w:r>
+      <w:r>
+        <w:t>: The application is designed for high-speed, short-duration tasks (micro-interactions). A typical task cycle (e.g., asking for a joke, checking the time, or updating a profile) takes between 10 to 60 seconds. This is a significant shift from traditional social apps where users spend hours browsing</w:t>
+      </w:r>
+      <w:r>
+        <w:t>.</w:t>
+      </w:r>
+      <w:r>
+        <w:t xml:space="preserve"> ChattyBot is built for "in-and-out" utility.</w:t>
+      </w:r>
+    </w:p>
+    <w:p>
+      <w:pPr>
+        <w:pStyle w:val="ListParagraph"/>
         <w:numPr>
           <w:ilvl w:val="0"/>
-          <w:numId w:val="1"/>
+          <w:numId w:val="4"/>
         </w:numPr>
-      </w:pPr>
-      <w:r>
-        <w:t>Any unique environmental constraints: mobile, outdoors, in-flight, and so on.?</w:t>
-      </w:r>
-    </w:p>
-    <w:p>
-      <w:pPr>
+        <w:jc w:val="both"/>
+      </w:pPr>
+      <w:r>
+        <w:rPr>
+          <w:b/>
+          <w:bCs/>
+        </w:rPr>
+        <w:lastRenderedPageBreak/>
+        <w:t>Environmental Constraints</w:t>
+      </w:r>
+      <w:r>
+        <w:t>: As a client-server architecture, the primary constraint is network connectivity. The user must be connected to the server to send messages and receive bot responses.</w:t>
+      </w:r>
+    </w:p>
+    <w:p>
+      <w:pPr>
+        <w:pStyle w:val="ListParagraph"/>
         <w:numPr>
           <w:ilvl w:val="0"/>
-          <w:numId w:val="1"/>
+          <w:numId w:val="4"/>
         </w:numPr>
-      </w:pPr>
-      <w:r>
-        <w:t>Which systems platforms are in use today? Future platforms?</w:t>
-      </w:r>
-    </w:p>
-    <w:p>
-      <w:pPr>
+        <w:jc w:val="both"/>
+      </w:pPr>
+      <w:r>
+        <w:rPr>
+          <w:b/>
+          <w:bCs/>
+        </w:rPr>
+        <w:t>System Platforms</w:t>
+      </w:r>
+      <w:r>
+        <w:t>:</w:t>
+      </w:r>
+    </w:p>
+    <w:p>
+      <w:pPr>
+        <w:pStyle w:val="ListParagraph"/>
         <w:numPr>
           <w:ilvl w:val="0"/>
-          <w:numId w:val="1"/>
+          <w:numId w:val="5"/>
         </w:numPr>
-      </w:pPr>
-      <w:r>
-        <w:t>What other applications are in use? Does your application need to integrate with them?</w:t>
-      </w:r>
-    </w:p>
-    <w:p>
-      <w:r>
-        <w:t>This is where extracts from the Business Model could be included to outline the task and business workers involved, and so on.]</w:t>
-      </w:r>
+        <w:jc w:val="both"/>
+      </w:pPr>
+      <w:r>
+        <w:rPr>
+          <w:b/>
+          <w:bCs/>
+        </w:rPr>
+        <w:t>Current</w:t>
+      </w:r>
+      <w:r>
+        <w:t>: The system operates on a cross-platform environment where the Server manages a centralized database (e.g., SQL-based) and the Client provides a clean UI for desktop or web use.</w:t>
+      </w:r>
+    </w:p>
+    <w:p>
+      <w:pPr>
+        <w:pStyle w:val="ListParagraph"/>
+        <w:numPr>
+          <w:ilvl w:val="0"/>
+          <w:numId w:val="5"/>
+        </w:numPr>
+        <w:jc w:val="both"/>
+      </w:pPr>
+      <w:r>
+        <w:rPr>
+          <w:b/>
+          <w:bCs/>
+        </w:rPr>
+        <w:t>Future</w:t>
+      </w:r>
+      <w:r>
+        <w:rPr>
+          <w:lang w:val="en-US"/>
+        </w:rPr>
+        <w:t xml:space="preserve">: </w:t>
+      </w:r>
+      <w:r>
+        <w:rPr>
+          <w:lang w:val="en-US"/>
+        </w:rPr>
+        <w:t>The architecture allows for future expansion into mobile platforms (Android/iOS) without changing the core server logic.</w:t>
+      </w:r>
+    </w:p>
+    <w:p>
+      <w:pPr>
+        <w:pStyle w:val="ListParagraph"/>
+        <w:numPr>
+          <w:ilvl w:val="0"/>
+          <w:numId w:val="6"/>
+        </w:numPr>
+        <w:jc w:val="both"/>
+      </w:pPr>
+      <w:r>
+        <w:rPr>
+          <w:b/>
+          <w:bCs/>
+        </w:rPr>
+        <w:t xml:space="preserve">Integration with </w:t>
+      </w:r>
+      <w:r>
+        <w:rPr>
+          <w:b/>
+          <w:bCs/>
+        </w:rPr>
+        <w:t>o</w:t>
+      </w:r>
+      <w:r>
+        <w:rPr>
+          <w:b/>
+          <w:bCs/>
+        </w:rPr>
+        <w:t xml:space="preserve">ther </w:t>
+      </w:r>
+      <w:r>
+        <w:rPr>
+          <w:b/>
+          <w:bCs/>
+        </w:rPr>
+        <w:t>a</w:t>
+      </w:r>
+      <w:r>
+        <w:rPr>
+          <w:b/>
+          <w:bCs/>
+        </w:rPr>
+        <w:t>pplications</w:t>
+      </w:r>
+      <w:r>
+        <w:t xml:space="preserve">: </w:t>
+      </w:r>
+      <w:r>
+        <w:t>By design, ChattyBot is a standalone, private environment. It does not integrate with large-scale social media APIs to avoid privacy "leaks." However, it supports data portability through JSON and XML exports, allowing users to integrate their chat history into their own personal archival tools or text editors.</w:t>
+      </w:r>
+    </w:p>
+    <w:p>
+      <w:pPr>
+        <w:pStyle w:val="ListParagraph"/>
+        <w:jc w:val="both"/>
+      </w:pPr>
     </w:p>
     <w:p>
       <w:pPr>
         <w:pStyle w:val="Heading1"/>
       </w:pPr>
-      <w:bookmarkStart w:id="13" w:name="_o7jwzigaruns" w:colFirst="0" w:colLast="0"/>
-      <w:bookmarkEnd w:id="13"/>
+      <w:bookmarkStart w:id="12" w:name="_o7jwzigaruns" w:colFirst="0" w:colLast="0"/>
+      <w:bookmarkEnd w:id="12"/>
       <w:r>
         <w:t>4. Product Requirements</w:t>
       </w:r>
     </w:p>
     <w:p>
-      <w:r>
-        <w:t>[At a high-level, list applicable standards, hardware or platform requirements, performance requirements, and environmental requirements.]</w:t>
-      </w:r>
-    </w:p>
-    <w:p/>
+      <w:pPr>
+        <w:ind w:firstLine="720"/>
+        <w:jc w:val="both"/>
+      </w:pPr>
+      <w:r>
+        <w:t>This section defines the technical and operational baseline for ChattyBot, focusing on the infrastructure and performance standards required for a successful deployment.</w:t>
+      </w:r>
+    </w:p>
+    <w:p>
+      <w:pPr>
+        <w:pStyle w:val="ListParagraph"/>
+        <w:numPr>
+          <w:ilvl w:val="0"/>
+          <w:numId w:val="6"/>
+        </w:numPr>
+        <w:jc w:val="both"/>
+      </w:pPr>
+      <w:r>
+        <w:rPr>
+          <w:b/>
+          <w:bCs/>
+        </w:rPr>
+        <w:t>Standards</w:t>
+      </w:r>
+      <w:r>
+        <w:t xml:space="preserve">: ChattyBot </w:t>
+      </w:r>
+      <w:r>
+        <w:t>uses</w:t>
+      </w:r>
+      <w:r>
+        <w:t xml:space="preserve"> a standardized REST API for communication. Data is transmitted via HTTPS for security, using JSON as the primary format for messaging and both JSON and XML for chat history exports to ensure data portability.</w:t>
+      </w:r>
+    </w:p>
+    <w:p>
+      <w:pPr>
+        <w:ind w:firstLine="720"/>
+        <w:jc w:val="both"/>
+      </w:pPr>
+    </w:p>
+    <w:p>
+      <w:pPr>
+        <w:pStyle w:val="ListParagraph"/>
+        <w:numPr>
+          <w:ilvl w:val="0"/>
+          <w:numId w:val="6"/>
+        </w:numPr>
+        <w:jc w:val="both"/>
+      </w:pPr>
+      <w:r>
+        <w:rPr>
+          <w:b/>
+          <w:bCs/>
+        </w:rPr>
+        <w:t>Hardware and Platform Requirements</w:t>
+      </w:r>
+      <w:r>
+        <w:t>: The server is built on ASP.NET Core, allowing it to be hosted on either Windows or Linux systems. It requires a centralized SQL database (such as SQL Server or SQLite) to store messages and profiles. The application is designed to be lightweight, meaning it does not require high-end hardware and runs efficiently on standard servers or basic consumer-grade computers.</w:t>
+      </w:r>
+    </w:p>
+    <w:p>
+      <w:pPr>
+        <w:ind w:firstLine="720"/>
+        <w:jc w:val="both"/>
+      </w:pPr>
+    </w:p>
+    <w:p>
+      <w:pPr>
+        <w:pStyle w:val="ListParagraph"/>
+        <w:numPr>
+          <w:ilvl w:val="0"/>
+          <w:numId w:val="6"/>
+        </w:numPr>
+        <w:jc w:val="both"/>
+      </w:pPr>
+      <w:r>
+        <w:rPr>
+          <w:b/>
+          <w:bCs/>
+        </w:rPr>
+        <w:t>Performance Requirements</w:t>
+      </w:r>
+      <w:r>
+        <w:t>: The bot is engineered to provide near-instant responses to ensure the conversation feels natural and fluid. The server must handle multiple concurrent users without significant lag or data interference between different chat sessions.</w:t>
+      </w:r>
+    </w:p>
+    <w:p>
+      <w:pPr>
+        <w:ind w:firstLine="720"/>
+        <w:jc w:val="both"/>
+      </w:pPr>
+    </w:p>
+    <w:p>
+      <w:pPr>
+        <w:pStyle w:val="ListParagraph"/>
+        <w:numPr>
+          <w:ilvl w:val="0"/>
+          <w:numId w:val="6"/>
+        </w:numPr>
+        <w:jc w:val="both"/>
+      </w:pPr>
+      <w:r>
+        <w:rPr>
+          <w:b/>
+          <w:bCs/>
+        </w:rPr>
+        <w:t>Environmental Requirements</w:t>
+      </w:r>
+      <w:r>
+        <w:t>: A stable network</w:t>
+      </w:r>
+      <w:r>
+        <w:t xml:space="preserve"> connection</w:t>
+      </w:r>
+      <w:r>
+        <w:t xml:space="preserve"> </w:t>
+      </w:r>
+      <w:r>
+        <w:t>is mandatory for the client application to communicate with the server. Furthermore, the server's hosting environment must be properly secured to protect the centralized database and user privacy.</w:t>
+      </w:r>
+    </w:p>
     <w:p/>
     <w:sectPr>
-      <w:headerReference w:type="default" r:id="rId7"/>
+      <w:headerReference w:type="default" r:id="rId14"/>
       <w:pgSz w:w="11909" w:h="16834"/>
       <w:pgMar w:top="1440" w:right="1440" w:bottom="1440" w:left="1440" w:header="720" w:footer="720" w:gutter="0"/>
       <w:pgNumType w:start="1"/>
@@ -3006,6 +4033,232 @@
 <file path=word/numbering.xml><?xml version="1.0" encoding="utf-8"?>
 <w:numbering xmlns:wpc="http://schemas.microsoft.com/office/word/2010/wordprocessingCanvas" xmlns:cx="http://schemas.microsoft.com/office/drawing/2014/chartex" xmlns:cx1="http://schemas.microsoft.com/office/drawing/2015/9/8/chartex" xmlns:cx2="http://schemas.microsoft.com/office/drawing/2015/10/21/chartex" xmlns:cx3="http://schemas.microsoft.com/office/drawing/2016/5/9/chartex" xmlns:cx4="http://schemas.microsoft.com/office/drawing/2016/5/10/chartex" xmlns:cx5="http://schemas.microsoft.com/office/drawing/2016/5/11/chartex" xmlns:cx6="http://schemas.microsoft.com/office/drawing/2016/5/12/chartex" xmlns:cx7="http://schemas.microsoft.com/office/drawing/2016/5/13/chartex" xmlns:cx8="http://schemas.microsoft.com/office/drawing/2016/5/14/chartex" xmlns:mc="http://schemas.openxmlformats.org/markup-compatibility/2006" xmlns:aink="http://schemas.microsoft.com/office/drawing/2016/ink" xmlns:am3d="http://schemas.microsoft.com/office/drawing/2017/model3d" xmlns:o="urn:schemas-microsoft-com:office:office" xmlns:oel="http://schemas.microsoft.com/office/2019/extlst" xmlns:r="http://schemas.openxmlformats.org/officeDocument/2006/relationships" xmlns:m="http://schemas.openxmlformats.org/officeDocument/2006/math" xmlns:v="urn:schemas-microsoft-com:vml" xmlns:wp14="http://schemas.microsoft.com/office/word/2010/wordprocessingDrawing" xmlns:wp="http://schemas.openxmlformats.org/drawingml/2006/wordprocessingDrawing" xmlns:w10="urn:schemas-microsoft-com:office:word" xmlns:w="http://schemas.openxmlformats.org/wordprocessingml/2006/main" xmlns:w14="http://schemas.microsoft.com/office/word/2010/wordml" xmlns:w15="http://schemas.microsoft.com/office/word/2012/wordml" xmlns:w16cex="http://schemas.microsoft.com/office/word/2018/wordml/cex" xmlns:w16cid="http://schemas.microsoft.com/office/word/2016/wordml/cid" xmlns:w16="http://schemas.microsoft.com/office/word/2018/wordml" xmlns:w16du="http://schemas.microsoft.com/office/word/2023/wordml/word16du" xmlns:w16sdtdh="http://schemas.microsoft.com/office/word/2020/wordml/sdtdatahash" xmlns:w16sdtfl="http://schemas.microsoft.com/office/word/2024/wordml/sdtformatlock" xmlns:w16se="http://schemas.microsoft.com/office/word/2015/wordml/symex" xmlns:wpg="http://schemas.microsoft.com/office/word/2010/wordprocessingGroup" xmlns:wpi="http://schemas.microsoft.com/office/word/2010/wordprocessingInk" xmlns:wne="http://schemas.microsoft.com/office/word/2006/wordml" xmlns:wps="http://schemas.microsoft.com/office/word/2010/wordprocessingShape" mc:Ignorable="w14 w15 w16se w16cid w16 w16cex w16sdtdh w16sdtfl w16du wp14">
   <w:abstractNum w:abstractNumId="0" w15:restartNumberingAfterBreak="0">
+    <w:nsid w:val="3CDC73B2"/>
+    <w:multiLevelType w:val="hybridMultilevel"/>
+    <w:tmpl w:val="AC2A4968"/>
+    <w:lvl w:ilvl="0" w:tplc="04090001">
+      <w:start w:val="1"/>
+      <w:numFmt w:val="bullet"/>
+      <w:lvlText w:val=""/>
+      <w:lvlJc w:val="left"/>
+      <w:pPr>
+        <w:ind w:left="720" w:hanging="360"/>
+      </w:pPr>
+      <w:rPr>
+        <w:rFonts w:ascii="Symbol" w:hAnsi="Symbol" w:hint="default"/>
+      </w:rPr>
+    </w:lvl>
+    <w:lvl w:ilvl="1" w:tplc="04090003" w:tentative="1">
+      <w:start w:val="1"/>
+      <w:numFmt w:val="bullet"/>
+      <w:lvlText w:val="o"/>
+      <w:lvlJc w:val="left"/>
+      <w:pPr>
+        <w:ind w:left="1440" w:hanging="360"/>
+      </w:pPr>
+      <w:rPr>
+        <w:rFonts w:ascii="Courier New" w:hAnsi="Courier New" w:cs="Courier New" w:hint="default"/>
+      </w:rPr>
+    </w:lvl>
+    <w:lvl w:ilvl="2" w:tplc="04090005" w:tentative="1">
+      <w:start w:val="1"/>
+      <w:numFmt w:val="bullet"/>
+      <w:lvlText w:val=""/>
+      <w:lvlJc w:val="left"/>
+      <w:pPr>
+        <w:ind w:left="2160" w:hanging="360"/>
+      </w:pPr>
+      <w:rPr>
+        <w:rFonts w:ascii="Wingdings" w:hAnsi="Wingdings" w:hint="default"/>
+      </w:rPr>
+    </w:lvl>
+    <w:lvl w:ilvl="3" w:tplc="04090001" w:tentative="1">
+      <w:start w:val="1"/>
+      <w:numFmt w:val="bullet"/>
+      <w:lvlText w:val=""/>
+      <w:lvlJc w:val="left"/>
+      <w:pPr>
+        <w:ind w:left="2880" w:hanging="360"/>
+      </w:pPr>
+      <w:rPr>
+        <w:rFonts w:ascii="Symbol" w:hAnsi="Symbol" w:hint="default"/>
+      </w:rPr>
+    </w:lvl>
+    <w:lvl w:ilvl="4" w:tplc="04090003" w:tentative="1">
+      <w:start w:val="1"/>
+      <w:numFmt w:val="bullet"/>
+      <w:lvlText w:val="o"/>
+      <w:lvlJc w:val="left"/>
+      <w:pPr>
+        <w:ind w:left="3600" w:hanging="360"/>
+      </w:pPr>
+      <w:rPr>
+        <w:rFonts w:ascii="Courier New" w:hAnsi="Courier New" w:cs="Courier New" w:hint="default"/>
+      </w:rPr>
+    </w:lvl>
+    <w:lvl w:ilvl="5" w:tplc="04090005" w:tentative="1">
+      <w:start w:val="1"/>
+      <w:numFmt w:val="bullet"/>
+      <w:lvlText w:val=""/>
+      <w:lvlJc w:val="left"/>
+      <w:pPr>
+        <w:ind w:left="4320" w:hanging="360"/>
+      </w:pPr>
+      <w:rPr>
+        <w:rFonts w:ascii="Wingdings" w:hAnsi="Wingdings" w:hint="default"/>
+      </w:rPr>
+    </w:lvl>
+    <w:lvl w:ilvl="6" w:tplc="04090001" w:tentative="1">
+      <w:start w:val="1"/>
+      <w:numFmt w:val="bullet"/>
+      <w:lvlText w:val=""/>
+      <w:lvlJc w:val="left"/>
+      <w:pPr>
+        <w:ind w:left="5040" w:hanging="360"/>
+      </w:pPr>
+      <w:rPr>
+        <w:rFonts w:ascii="Symbol" w:hAnsi="Symbol" w:hint="default"/>
+      </w:rPr>
+    </w:lvl>
+    <w:lvl w:ilvl="7" w:tplc="04090003" w:tentative="1">
+      <w:start w:val="1"/>
+      <w:numFmt w:val="bullet"/>
+      <w:lvlText w:val="o"/>
+      <w:lvlJc w:val="left"/>
+      <w:pPr>
+        <w:ind w:left="5760" w:hanging="360"/>
+      </w:pPr>
+      <w:rPr>
+        <w:rFonts w:ascii="Courier New" w:hAnsi="Courier New" w:cs="Courier New" w:hint="default"/>
+      </w:rPr>
+    </w:lvl>
+    <w:lvl w:ilvl="8" w:tplc="04090005" w:tentative="1">
+      <w:start w:val="1"/>
+      <w:numFmt w:val="bullet"/>
+      <w:lvlText w:val=""/>
+      <w:lvlJc w:val="left"/>
+      <w:pPr>
+        <w:ind w:left="6480" w:hanging="360"/>
+      </w:pPr>
+      <w:rPr>
+        <w:rFonts w:ascii="Wingdings" w:hAnsi="Wingdings" w:hint="default"/>
+      </w:rPr>
+    </w:lvl>
+  </w:abstractNum>
+  <w:abstractNum w:abstractNumId="1" w15:restartNumberingAfterBreak="0">
+    <w:nsid w:val="44FE0652"/>
+    <w:multiLevelType w:val="hybridMultilevel"/>
+    <w:tmpl w:val="55B8DD68"/>
+    <w:lvl w:ilvl="0" w:tplc="04090001">
+      <w:start w:val="1"/>
+      <w:numFmt w:val="bullet"/>
+      <w:lvlText w:val=""/>
+      <w:lvlJc w:val="left"/>
+      <w:pPr>
+        <w:ind w:left="720" w:hanging="360"/>
+      </w:pPr>
+      <w:rPr>
+        <w:rFonts w:ascii="Symbol" w:hAnsi="Symbol" w:hint="default"/>
+      </w:rPr>
+    </w:lvl>
+    <w:lvl w:ilvl="1" w:tplc="04090003" w:tentative="1">
+      <w:start w:val="1"/>
+      <w:numFmt w:val="bullet"/>
+      <w:lvlText w:val="o"/>
+      <w:lvlJc w:val="left"/>
+      <w:pPr>
+        <w:ind w:left="1440" w:hanging="360"/>
+      </w:pPr>
+      <w:rPr>
+        <w:rFonts w:ascii="Courier New" w:hAnsi="Courier New" w:cs="Courier New" w:hint="default"/>
+      </w:rPr>
+    </w:lvl>
+    <w:lvl w:ilvl="2" w:tplc="04090005" w:tentative="1">
+      <w:start w:val="1"/>
+      <w:numFmt w:val="bullet"/>
+      <w:lvlText w:val=""/>
+      <w:lvlJc w:val="left"/>
+      <w:pPr>
+        <w:ind w:left="2160" w:hanging="360"/>
+      </w:pPr>
+      <w:rPr>
+        <w:rFonts w:ascii="Wingdings" w:hAnsi="Wingdings" w:hint="default"/>
+      </w:rPr>
+    </w:lvl>
+    <w:lvl w:ilvl="3" w:tplc="04090001" w:tentative="1">
+      <w:start w:val="1"/>
+      <w:numFmt w:val="bullet"/>
+      <w:lvlText w:val=""/>
+      <w:lvlJc w:val="left"/>
+      <w:pPr>
+        <w:ind w:left="2880" w:hanging="360"/>
+      </w:pPr>
+      <w:rPr>
+        <w:rFonts w:ascii="Symbol" w:hAnsi="Symbol" w:hint="default"/>
+      </w:rPr>
+    </w:lvl>
+    <w:lvl w:ilvl="4" w:tplc="04090003" w:tentative="1">
+      <w:start w:val="1"/>
+      <w:numFmt w:val="bullet"/>
+      <w:lvlText w:val="o"/>
+      <w:lvlJc w:val="left"/>
+      <w:pPr>
+        <w:ind w:left="3600" w:hanging="360"/>
+      </w:pPr>
+      <w:rPr>
+        <w:rFonts w:ascii="Courier New" w:hAnsi="Courier New" w:cs="Courier New" w:hint="default"/>
+      </w:rPr>
+    </w:lvl>
+    <w:lvl w:ilvl="5" w:tplc="04090005" w:tentative="1">
+      <w:start w:val="1"/>
+      <w:numFmt w:val="bullet"/>
+      <w:lvlText w:val=""/>
+      <w:lvlJc w:val="left"/>
+      <w:pPr>
+        <w:ind w:left="4320" w:hanging="360"/>
+      </w:pPr>
+      <w:rPr>
+        <w:rFonts w:ascii="Wingdings" w:hAnsi="Wingdings" w:hint="default"/>
+      </w:rPr>
+    </w:lvl>
+    <w:lvl w:ilvl="6" w:tplc="04090001" w:tentative="1">
+      <w:start w:val="1"/>
+      <w:numFmt w:val="bullet"/>
+      <w:lvlText w:val=""/>
+      <w:lvlJc w:val="left"/>
+      <w:pPr>
+        <w:ind w:left="5040" w:hanging="360"/>
+      </w:pPr>
+      <w:rPr>
+        <w:rFonts w:ascii="Symbol" w:hAnsi="Symbol" w:hint="default"/>
+      </w:rPr>
+    </w:lvl>
+    <w:lvl w:ilvl="7" w:tplc="04090003" w:tentative="1">
+      <w:start w:val="1"/>
+      <w:numFmt w:val="bullet"/>
+      <w:lvlText w:val="o"/>
+      <w:lvlJc w:val="left"/>
+      <w:pPr>
+        <w:ind w:left="5760" w:hanging="360"/>
+      </w:pPr>
+      <w:rPr>
+        <w:rFonts w:ascii="Courier New" w:hAnsi="Courier New" w:cs="Courier New" w:hint="default"/>
+      </w:rPr>
+    </w:lvl>
+    <w:lvl w:ilvl="8" w:tplc="04090005" w:tentative="1">
+      <w:start w:val="1"/>
+      <w:numFmt w:val="bullet"/>
+      <w:lvlText w:val=""/>
+      <w:lvlJc w:val="left"/>
+      <w:pPr>
+        <w:ind w:left="6480" w:hanging="360"/>
+      </w:pPr>
+      <w:rPr>
+        <w:rFonts w:ascii="Wingdings" w:hAnsi="Wingdings" w:hint="default"/>
+      </w:rPr>
+    </w:lvl>
+  </w:abstractNum>
+  <w:abstractNum w:abstractNumId="2" w15:restartNumberingAfterBreak="0">
     <w:nsid w:val="45A74E81"/>
     <w:multiLevelType w:val="hybridMultilevel"/>
     <w:tmpl w:val="BB30C34C"/>
@@ -3118,7 +4371,233 @@
       </w:rPr>
     </w:lvl>
   </w:abstractNum>
-  <w:abstractNum w:abstractNumId="1" w15:restartNumberingAfterBreak="0">
+  <w:abstractNum w:abstractNumId="3" w15:restartNumberingAfterBreak="0">
+    <w:nsid w:val="542F6268"/>
+    <w:multiLevelType w:val="hybridMultilevel"/>
+    <w:tmpl w:val="091CCA10"/>
+    <w:lvl w:ilvl="0" w:tplc="04090003">
+      <w:start w:val="1"/>
+      <w:numFmt w:val="bullet"/>
+      <w:lvlText w:val="o"/>
+      <w:lvlJc w:val="left"/>
+      <w:pPr>
+        <w:ind w:left="1440" w:hanging="360"/>
+      </w:pPr>
+      <w:rPr>
+        <w:rFonts w:ascii="Courier New" w:hAnsi="Courier New" w:cs="Courier New" w:hint="default"/>
+      </w:rPr>
+    </w:lvl>
+    <w:lvl w:ilvl="1" w:tplc="04090003" w:tentative="1">
+      <w:start w:val="1"/>
+      <w:numFmt w:val="bullet"/>
+      <w:lvlText w:val="o"/>
+      <w:lvlJc w:val="left"/>
+      <w:pPr>
+        <w:ind w:left="2160" w:hanging="360"/>
+      </w:pPr>
+      <w:rPr>
+        <w:rFonts w:ascii="Courier New" w:hAnsi="Courier New" w:cs="Courier New" w:hint="default"/>
+      </w:rPr>
+    </w:lvl>
+    <w:lvl w:ilvl="2" w:tplc="04090005" w:tentative="1">
+      <w:start w:val="1"/>
+      <w:numFmt w:val="bullet"/>
+      <w:lvlText w:val=""/>
+      <w:lvlJc w:val="left"/>
+      <w:pPr>
+        <w:ind w:left="2880" w:hanging="360"/>
+      </w:pPr>
+      <w:rPr>
+        <w:rFonts w:ascii="Wingdings" w:hAnsi="Wingdings" w:hint="default"/>
+      </w:rPr>
+    </w:lvl>
+    <w:lvl w:ilvl="3" w:tplc="04090001" w:tentative="1">
+      <w:start w:val="1"/>
+      <w:numFmt w:val="bullet"/>
+      <w:lvlText w:val=""/>
+      <w:lvlJc w:val="left"/>
+      <w:pPr>
+        <w:ind w:left="3600" w:hanging="360"/>
+      </w:pPr>
+      <w:rPr>
+        <w:rFonts w:ascii="Symbol" w:hAnsi="Symbol" w:hint="default"/>
+      </w:rPr>
+    </w:lvl>
+    <w:lvl w:ilvl="4" w:tplc="04090003" w:tentative="1">
+      <w:start w:val="1"/>
+      <w:numFmt w:val="bullet"/>
+      <w:lvlText w:val="o"/>
+      <w:lvlJc w:val="left"/>
+      <w:pPr>
+        <w:ind w:left="4320" w:hanging="360"/>
+      </w:pPr>
+      <w:rPr>
+        <w:rFonts w:ascii="Courier New" w:hAnsi="Courier New" w:cs="Courier New" w:hint="default"/>
+      </w:rPr>
+    </w:lvl>
+    <w:lvl w:ilvl="5" w:tplc="04090005" w:tentative="1">
+      <w:start w:val="1"/>
+      <w:numFmt w:val="bullet"/>
+      <w:lvlText w:val=""/>
+      <w:lvlJc w:val="left"/>
+      <w:pPr>
+        <w:ind w:left="5040" w:hanging="360"/>
+      </w:pPr>
+      <w:rPr>
+        <w:rFonts w:ascii="Wingdings" w:hAnsi="Wingdings" w:hint="default"/>
+      </w:rPr>
+    </w:lvl>
+    <w:lvl w:ilvl="6" w:tplc="04090001" w:tentative="1">
+      <w:start w:val="1"/>
+      <w:numFmt w:val="bullet"/>
+      <w:lvlText w:val=""/>
+      <w:lvlJc w:val="left"/>
+      <w:pPr>
+        <w:ind w:left="5760" w:hanging="360"/>
+      </w:pPr>
+      <w:rPr>
+        <w:rFonts w:ascii="Symbol" w:hAnsi="Symbol" w:hint="default"/>
+      </w:rPr>
+    </w:lvl>
+    <w:lvl w:ilvl="7" w:tplc="04090003" w:tentative="1">
+      <w:start w:val="1"/>
+      <w:numFmt w:val="bullet"/>
+      <w:lvlText w:val="o"/>
+      <w:lvlJc w:val="left"/>
+      <w:pPr>
+        <w:ind w:left="6480" w:hanging="360"/>
+      </w:pPr>
+      <w:rPr>
+        <w:rFonts w:ascii="Courier New" w:hAnsi="Courier New" w:cs="Courier New" w:hint="default"/>
+      </w:rPr>
+    </w:lvl>
+    <w:lvl w:ilvl="8" w:tplc="04090005" w:tentative="1">
+      <w:start w:val="1"/>
+      <w:numFmt w:val="bullet"/>
+      <w:lvlText w:val=""/>
+      <w:lvlJc w:val="left"/>
+      <w:pPr>
+        <w:ind w:left="7200" w:hanging="360"/>
+      </w:pPr>
+      <w:rPr>
+        <w:rFonts w:ascii="Wingdings" w:hAnsi="Wingdings" w:hint="default"/>
+      </w:rPr>
+    </w:lvl>
+  </w:abstractNum>
+  <w:abstractNum w:abstractNumId="4" w15:restartNumberingAfterBreak="0">
+    <w:nsid w:val="552E7CE8"/>
+    <w:multiLevelType w:val="hybridMultilevel"/>
+    <w:tmpl w:val="5BF8912A"/>
+    <w:lvl w:ilvl="0" w:tplc="04090001">
+      <w:start w:val="1"/>
+      <w:numFmt w:val="bullet"/>
+      <w:lvlText w:val=""/>
+      <w:lvlJc w:val="left"/>
+      <w:pPr>
+        <w:ind w:left="720" w:hanging="360"/>
+      </w:pPr>
+      <w:rPr>
+        <w:rFonts w:ascii="Symbol" w:hAnsi="Symbol" w:hint="default"/>
+      </w:rPr>
+    </w:lvl>
+    <w:lvl w:ilvl="1" w:tplc="04090003" w:tentative="1">
+      <w:start w:val="1"/>
+      <w:numFmt w:val="bullet"/>
+      <w:lvlText w:val="o"/>
+      <w:lvlJc w:val="left"/>
+      <w:pPr>
+        <w:ind w:left="1440" w:hanging="360"/>
+      </w:pPr>
+      <w:rPr>
+        <w:rFonts w:ascii="Courier New" w:hAnsi="Courier New" w:cs="Courier New" w:hint="default"/>
+      </w:rPr>
+    </w:lvl>
+    <w:lvl w:ilvl="2" w:tplc="04090005" w:tentative="1">
+      <w:start w:val="1"/>
+      <w:numFmt w:val="bullet"/>
+      <w:lvlText w:val=""/>
+      <w:lvlJc w:val="left"/>
+      <w:pPr>
+        <w:ind w:left="2160" w:hanging="360"/>
+      </w:pPr>
+      <w:rPr>
+        <w:rFonts w:ascii="Wingdings" w:hAnsi="Wingdings" w:hint="default"/>
+      </w:rPr>
+    </w:lvl>
+    <w:lvl w:ilvl="3" w:tplc="04090001" w:tentative="1">
+      <w:start w:val="1"/>
+      <w:numFmt w:val="bullet"/>
+      <w:lvlText w:val=""/>
+      <w:lvlJc w:val="left"/>
+      <w:pPr>
+        <w:ind w:left="2880" w:hanging="360"/>
+      </w:pPr>
+      <w:rPr>
+        <w:rFonts w:ascii="Symbol" w:hAnsi="Symbol" w:hint="default"/>
+      </w:rPr>
+    </w:lvl>
+    <w:lvl w:ilvl="4" w:tplc="04090003" w:tentative="1">
+      <w:start w:val="1"/>
+      <w:numFmt w:val="bullet"/>
+      <w:lvlText w:val="o"/>
+      <w:lvlJc w:val="left"/>
+      <w:pPr>
+        <w:ind w:left="3600" w:hanging="360"/>
+      </w:pPr>
+      <w:rPr>
+        <w:rFonts w:ascii="Courier New" w:hAnsi="Courier New" w:cs="Courier New" w:hint="default"/>
+      </w:rPr>
+    </w:lvl>
+    <w:lvl w:ilvl="5" w:tplc="04090005" w:tentative="1">
+      <w:start w:val="1"/>
+      <w:numFmt w:val="bullet"/>
+      <w:lvlText w:val=""/>
+      <w:lvlJc w:val="left"/>
+      <w:pPr>
+        <w:ind w:left="4320" w:hanging="360"/>
+      </w:pPr>
+      <w:rPr>
+        <w:rFonts w:ascii="Wingdings" w:hAnsi="Wingdings" w:hint="default"/>
+      </w:rPr>
+    </w:lvl>
+    <w:lvl w:ilvl="6" w:tplc="04090001" w:tentative="1">
+      <w:start w:val="1"/>
+      <w:numFmt w:val="bullet"/>
+      <w:lvlText w:val=""/>
+      <w:lvlJc w:val="left"/>
+      <w:pPr>
+        <w:ind w:left="5040" w:hanging="360"/>
+      </w:pPr>
+      <w:rPr>
+        <w:rFonts w:ascii="Symbol" w:hAnsi="Symbol" w:hint="default"/>
+      </w:rPr>
+    </w:lvl>
+    <w:lvl w:ilvl="7" w:tplc="04090003" w:tentative="1">
+      <w:start w:val="1"/>
+      <w:numFmt w:val="bullet"/>
+      <w:lvlText w:val="o"/>
+      <w:lvlJc w:val="left"/>
+      <w:pPr>
+        <w:ind w:left="5760" w:hanging="360"/>
+      </w:pPr>
+      <w:rPr>
+        <w:rFonts w:ascii="Courier New" w:hAnsi="Courier New" w:cs="Courier New" w:hint="default"/>
+      </w:rPr>
+    </w:lvl>
+    <w:lvl w:ilvl="8" w:tplc="04090005" w:tentative="1">
+      <w:start w:val="1"/>
+      <w:numFmt w:val="bullet"/>
+      <w:lvlText w:val=""/>
+      <w:lvlJc w:val="left"/>
+      <w:pPr>
+        <w:ind w:left="6480" w:hanging="360"/>
+      </w:pPr>
+      <w:rPr>
+        <w:rFonts w:ascii="Wingdings" w:hAnsi="Wingdings" w:hint="default"/>
+      </w:rPr>
+    </w:lvl>
+  </w:abstractNum>
+  <w:abstractNum w:abstractNumId="5" w15:restartNumberingAfterBreak="0">
     <w:nsid w:val="606F3D9C"/>
     <w:multiLevelType w:val="multilevel"/>
     <w:tmpl w:val="5CC0ACEA"/>
@@ -3231,11 +4710,139 @@
       </w:rPr>
     </w:lvl>
   </w:abstractNum>
+  <w:abstractNum w:abstractNumId="6" w15:restartNumberingAfterBreak="0">
+    <w:nsid w:val="708737F5"/>
+    <w:multiLevelType w:val="hybridMultilevel"/>
+    <w:tmpl w:val="D2BE5022"/>
+    <w:lvl w:ilvl="0" w:tplc="04090001">
+      <w:start w:val="1"/>
+      <w:numFmt w:val="bullet"/>
+      <w:lvlText w:val=""/>
+      <w:lvlJc w:val="left"/>
+      <w:pPr>
+        <w:ind w:left="720" w:hanging="360"/>
+      </w:pPr>
+      <w:rPr>
+        <w:rFonts w:ascii="Symbol" w:hAnsi="Symbol" w:hint="default"/>
+      </w:rPr>
+    </w:lvl>
+    <w:lvl w:ilvl="1" w:tplc="04090003" w:tentative="1">
+      <w:start w:val="1"/>
+      <w:numFmt w:val="bullet"/>
+      <w:lvlText w:val="o"/>
+      <w:lvlJc w:val="left"/>
+      <w:pPr>
+        <w:ind w:left="1440" w:hanging="360"/>
+      </w:pPr>
+      <w:rPr>
+        <w:rFonts w:ascii="Courier New" w:hAnsi="Courier New" w:cs="Courier New" w:hint="default"/>
+      </w:rPr>
+    </w:lvl>
+    <w:lvl w:ilvl="2" w:tplc="04090005" w:tentative="1">
+      <w:start w:val="1"/>
+      <w:numFmt w:val="bullet"/>
+      <w:lvlText w:val=""/>
+      <w:lvlJc w:val="left"/>
+      <w:pPr>
+        <w:ind w:left="2160" w:hanging="360"/>
+      </w:pPr>
+      <w:rPr>
+        <w:rFonts w:ascii="Wingdings" w:hAnsi="Wingdings" w:hint="default"/>
+      </w:rPr>
+    </w:lvl>
+    <w:lvl w:ilvl="3" w:tplc="04090001" w:tentative="1">
+      <w:start w:val="1"/>
+      <w:numFmt w:val="bullet"/>
+      <w:lvlText w:val=""/>
+      <w:lvlJc w:val="left"/>
+      <w:pPr>
+        <w:ind w:left="2880" w:hanging="360"/>
+      </w:pPr>
+      <w:rPr>
+        <w:rFonts w:ascii="Symbol" w:hAnsi="Symbol" w:hint="default"/>
+      </w:rPr>
+    </w:lvl>
+    <w:lvl w:ilvl="4" w:tplc="04090003" w:tentative="1">
+      <w:start w:val="1"/>
+      <w:numFmt w:val="bullet"/>
+      <w:lvlText w:val="o"/>
+      <w:lvlJc w:val="left"/>
+      <w:pPr>
+        <w:ind w:left="3600" w:hanging="360"/>
+      </w:pPr>
+      <w:rPr>
+        <w:rFonts w:ascii="Courier New" w:hAnsi="Courier New" w:cs="Courier New" w:hint="default"/>
+      </w:rPr>
+    </w:lvl>
+    <w:lvl w:ilvl="5" w:tplc="04090005" w:tentative="1">
+      <w:start w:val="1"/>
+      <w:numFmt w:val="bullet"/>
+      <w:lvlText w:val=""/>
+      <w:lvlJc w:val="left"/>
+      <w:pPr>
+        <w:ind w:left="4320" w:hanging="360"/>
+      </w:pPr>
+      <w:rPr>
+        <w:rFonts w:ascii="Wingdings" w:hAnsi="Wingdings" w:hint="default"/>
+      </w:rPr>
+    </w:lvl>
+    <w:lvl w:ilvl="6" w:tplc="04090001" w:tentative="1">
+      <w:start w:val="1"/>
+      <w:numFmt w:val="bullet"/>
+      <w:lvlText w:val=""/>
+      <w:lvlJc w:val="left"/>
+      <w:pPr>
+        <w:ind w:left="5040" w:hanging="360"/>
+      </w:pPr>
+      <w:rPr>
+        <w:rFonts w:ascii="Symbol" w:hAnsi="Symbol" w:hint="default"/>
+      </w:rPr>
+    </w:lvl>
+    <w:lvl w:ilvl="7" w:tplc="04090003" w:tentative="1">
+      <w:start w:val="1"/>
+      <w:numFmt w:val="bullet"/>
+      <w:lvlText w:val="o"/>
+      <w:lvlJc w:val="left"/>
+      <w:pPr>
+        <w:ind w:left="5760" w:hanging="360"/>
+      </w:pPr>
+      <w:rPr>
+        <w:rFonts w:ascii="Courier New" w:hAnsi="Courier New" w:cs="Courier New" w:hint="default"/>
+      </w:rPr>
+    </w:lvl>
+    <w:lvl w:ilvl="8" w:tplc="04090005" w:tentative="1">
+      <w:start w:val="1"/>
+      <w:numFmt w:val="bullet"/>
+      <w:lvlText w:val=""/>
+      <w:lvlJc w:val="left"/>
+      <w:pPr>
+        <w:ind w:left="6480" w:hanging="360"/>
+      </w:pPr>
+      <w:rPr>
+        <w:rFonts w:ascii="Wingdings" w:hAnsi="Wingdings" w:hint="default"/>
+      </w:rPr>
+    </w:lvl>
+  </w:abstractNum>
   <w:num w:numId="1" w16cid:durableId="1267038413">
-    <w:abstractNumId w:val="1"/>
+    <w:abstractNumId w:val="5"/>
   </w:num>
   <w:num w:numId="2" w16cid:durableId="814102506">
+    <w:abstractNumId w:val="2"/>
+  </w:num>
+  <w:num w:numId="3" w16cid:durableId="909269276">
+    <w:abstractNumId w:val="4"/>
+  </w:num>
+  <w:num w:numId="4" w16cid:durableId="1981881324">
+    <w:abstractNumId w:val="6"/>
+  </w:num>
+  <w:num w:numId="5" w16cid:durableId="299851223">
+    <w:abstractNumId w:val="3"/>
+  </w:num>
+  <w:num w:numId="6" w16cid:durableId="756369453">
     <w:abstractNumId w:val="0"/>
+  </w:num>
+  <w:num w:numId="7" w16cid:durableId="1076323613">
+    <w:abstractNumId w:val="1"/>
   </w:num>
 </w:numbering>
 </file>
@@ -3868,6 +5475,29 @@
       <w:contextualSpacing/>
     </w:pPr>
   </w:style>
+  <w:style w:type="character" w:styleId="Hyperlink">
+    <w:name w:val="Hyperlink"/>
+    <w:basedOn w:val="DefaultParagraphFont"/>
+    <w:uiPriority w:val="99"/>
+    <w:unhideWhenUsed/>
+    <w:rsid w:val="00876BD2"/>
+    <w:rPr>
+      <w:color w:val="0000FF" w:themeColor="hyperlink"/>
+      <w:u w:val="single"/>
+    </w:rPr>
+  </w:style>
+  <w:style w:type="character" w:styleId="UnresolvedMention">
+    <w:name w:val="Unresolved Mention"/>
+    <w:basedOn w:val="DefaultParagraphFont"/>
+    <w:uiPriority w:val="99"/>
+    <w:semiHidden/>
+    <w:unhideWhenUsed/>
+    <w:rsid w:val="00876BD2"/>
+    <w:rPr>
+      <w:color w:val="605E5C"/>
+      <w:shd w:val="clear" w:color="auto" w:fill="E1DFDD"/>
+    </w:rPr>
+  </w:style>
 </w:styles>
 </file>
 
@@ -4189,4 +5819,16 @@
   </a:objectDefaults>
   <a:extraClrSchemeLst/>
 </a:theme>
+</file>
+
+<file path=customXml/item1.xml><?xml version="1.0" encoding="utf-8"?>
+<b:Sources xmlns:b="http://schemas.openxmlformats.org/officeDocument/2006/bibliography" xmlns="http://schemas.openxmlformats.org/officeDocument/2006/bibliography" SelectedStyle="\APASixthEditionOfficeOnline.xsl" StyleName="APA" Version="6"/>
+</file>
+
+<file path=customXml/itemProps1.xml><?xml version="1.0" encoding="utf-8"?>
+<ds:datastoreItem xmlns:ds="http://schemas.openxmlformats.org/officeDocument/2006/customXml" ds:itemID="{F238AD73-AE8A-4C98-B738-CC575D8CA737}">
+  <ds:schemaRefs>
+    <ds:schemaRef ds:uri="http://schemas.openxmlformats.org/officeDocument/2006/bibliography"/>
+  </ds:schemaRefs>
+</ds:datastoreItem>
 </file>
</xml_diff>

<commit_message>
docs(Use Case Model): updated Use Case Model document
</commit_message>
<xml_diff>
--- a/docs/01 Vision.docx
+++ b/docs/01 Vision.docx
@@ -138,7 +138,25 @@
           <w:sz w:val="28"/>
           <w:szCs w:val="28"/>
         </w:rPr>
-        <w:t>Version 1.0</w:t>
+        <w:t xml:space="preserve">Version </w:t>
+      </w:r>
+      <w:r>
+        <w:rPr>
+          <w:b/>
+          <w:bCs/>
+          <w:sz w:val="28"/>
+          <w:szCs w:val="28"/>
+        </w:rPr>
+        <w:t>2</w:t>
+      </w:r>
+      <w:r>
+        <w:rPr>
+          <w:b/>
+          <w:bCs/>
+          <w:sz w:val="28"/>
+          <w:szCs w:val="28"/>
+        </w:rPr>
+        <w:t>.0</w:t>
       </w:r>
     </w:p>
     <w:p>
@@ -969,21 +987,7 @@
                 <w:color w:val="1155CC"/>
                 <w:u w:val="single"/>
               </w:rPr>
-              <w:t>1. I</w:t>
-            </w:r>
-            <w:r>
-              <w:rPr>
-                <w:color w:val="1155CC"/>
-                <w:u w:val="single"/>
-              </w:rPr>
-              <w:t>n</w:t>
-            </w:r>
-            <w:r>
-              <w:rPr>
-                <w:color w:val="1155CC"/>
-                <w:u w:val="single"/>
-              </w:rPr>
-              <w:t>troduction</w:t>
+              <w:t>1. Introduction</w:t>
             </w:r>
           </w:hyperlink>
         </w:p>
@@ -1806,13 +1810,7 @@
         <w:t>Section 2: Positioning</w:t>
       </w:r>
       <w:r>
-        <w:t xml:space="preserve"> </w:t>
-      </w:r>
-      <w:r>
-        <w:t>-</w:t>
-      </w:r>
-      <w:r>
-        <w:t xml:space="preserve"> Describes the business context and the specific problem this chat application aims to solve. It defines the unique value proposition and how the product compares to existing alternatives.</w:t>
+        <w:t xml:space="preserve"> - Describes the business context and the specific problem this chat application aims to solve. It defines the unique value proposition and how the product compares to existing alternatives.</w:t>
       </w:r>
     </w:p>
     <w:p>
@@ -1832,13 +1830,7 @@
         <w:t>Section 3: Stakeholder and User Descriptions</w:t>
       </w:r>
       <w:r>
-        <w:t xml:space="preserve"> </w:t>
-      </w:r>
-      <w:r>
-        <w:t>-</w:t>
-      </w:r>
-      <w:r>
-        <w:t xml:space="preserve"> Identifies the key individuals and groups involved in the project, profiling the target end-users and the environment in which they will interact with the system.</w:t>
+        <w:t xml:space="preserve"> - Identifies the key individuals and groups involved in the project, profiling the target end-users and the environment in which they will interact with the system.</w:t>
       </w:r>
     </w:p>
     <w:p>
@@ -1858,13 +1850,7 @@
         <w:t>Section 4: Product Requirements</w:t>
       </w:r>
       <w:r>
-        <w:t xml:space="preserve"> </w:t>
-      </w:r>
-      <w:r>
-        <w:t>-</w:t>
-      </w:r>
-      <w:r>
-        <w:t xml:space="preserve"> Outlines the high-level technical constraints, including hardware requirements, platform standards, and performance expectations necessary for a successful implementation.</w:t>
+        <w:t xml:space="preserve"> - Outlines the high-level technical constraints, including hardware requirements, platform standards, and performance expectations necessary for a successful implementation.</w:t>
       </w:r>
     </w:p>
     <w:p>
@@ -3460,10 +3446,7 @@
               <w:spacing w:after="120" w:line="240" w:lineRule="auto"/>
             </w:pPr>
             <w:r>
-              <w:t>• Produces reports by requesting chat log exports from the server</w:t>
-            </w:r>
-            <w:r>
-              <w:t>.</w:t>
+              <w:t>• Produces reports by requesting chat log exports from the server.</w:t>
             </w:r>
           </w:p>
           <w:p>
@@ -3623,35 +3606,7 @@
           <w:b/>
           <w:bCs/>
         </w:rPr>
-        <w:t xml:space="preserve">Number of </w:t>
-      </w:r>
-      <w:r>
-        <w:rPr>
-          <w:b/>
-          <w:bCs/>
-        </w:rPr>
-        <w:t>p</w:t>
-      </w:r>
-      <w:r>
-        <w:rPr>
-          <w:b/>
-          <w:bCs/>
-        </w:rPr>
-        <w:t>eop</w:t>
-      </w:r>
-      <w:r>
-        <w:rPr>
-          <w:b/>
-          <w:bCs/>
-        </w:rPr>
-        <w:t>e i</w:t>
-      </w:r>
-      <w:r>
-        <w:rPr>
-          <w:b/>
-          <w:bCs/>
-        </w:rPr>
-        <w:t>nvolved</w:t>
+        <w:t>Number of peope involved</w:t>
       </w:r>
       <w:r>
         <w:t>: The interaction is primarily one-on-one: a single user interacting with the rule-based bot. While the system can support multiple users simultaneously via the server, each chat session is private. The System Administrator monitors the backend but does not interfere with individual user sessions.</w:t>
@@ -3787,35 +3742,7 @@
           <w:b/>
           <w:bCs/>
         </w:rPr>
-        <w:t xml:space="preserve">Integration with </w:t>
-      </w:r>
-      <w:r>
-        <w:rPr>
-          <w:b/>
-          <w:bCs/>
-        </w:rPr>
-        <w:t>o</w:t>
-      </w:r>
-      <w:r>
-        <w:rPr>
-          <w:b/>
-          <w:bCs/>
-        </w:rPr>
-        <w:t xml:space="preserve">ther </w:t>
-      </w:r>
-      <w:r>
-        <w:rPr>
-          <w:b/>
-          <w:bCs/>
-        </w:rPr>
-        <w:t>a</w:t>
-      </w:r>
-      <w:r>
-        <w:rPr>
-          <w:b/>
-          <w:bCs/>
-        </w:rPr>
-        <w:t>pplications</w:t>
+        <w:t>Integration with other applications</w:t>
       </w:r>
       <w:r>
         <w:t xml:space="preserve">: </w:t>
@@ -5362,6 +5289,7 @@
   <w:style w:type="character" w:default="1" w:styleId="DefaultParagraphFont">
     <w:name w:val="Default Paragraph Font"/>
     <w:uiPriority w:val="1"/>
+    <w:semiHidden/>
     <w:unhideWhenUsed/>
   </w:style>
   <w:style w:type="table" w:default="1" w:styleId="TableNormal">

</xml_diff>

<commit_message>
docs: added Glossary references to Vision document
</commit_message>
<xml_diff>
--- a/docs/01 Vision.docx
+++ b/docs/01 Vision.docx
@@ -1457,6 +1457,28 @@
     </w:p>
     <w:p>
       <w:pPr>
+        <w:ind w:firstLine="360"/>
+        <w:jc w:val="both"/>
+      </w:pPr>
+      <w:r>
+        <w:t xml:space="preserve">For a comprehensive and detailed list of technical terms, acronyms, and domain-specific definitions, please refer to the </w:t>
+      </w:r>
+      <w:r>
+        <w:rPr>
+          <w:b/>
+          <w:bCs/>
+        </w:rPr>
+        <w:t>03 Glossary</w:t>
+      </w:r>
+      <w:r>
+        <w:t xml:space="preserve"> document</w:t>
+      </w:r>
+      <w:r>
+        <w:t>:</w:t>
+      </w:r>
+    </w:p>
+    <w:p>
+      <w:pPr>
         <w:pStyle w:val="ListParagraph"/>
         <w:numPr>
           <w:ilvl w:val="0"/>
@@ -1472,7 +1494,28 @@
         <w:t>Client</w:t>
       </w:r>
       <w:r>
-        <w:t>: The front-end application used by the user to send messages, issue commands, and view chat history.</w:t>
+        <w:rPr>
+          <w:b/>
+          <w:bCs/>
+        </w:rPr>
+        <w:t xml:space="preserve"> </w:t>
+      </w:r>
+      <w:r>
+        <w:rPr>
+          <w:b/>
+          <w:bCs/>
+        </w:rPr>
+        <w:t>–</w:t>
+      </w:r>
+      <w:r>
+        <w:rPr>
+          <w:b/>
+          <w:bCs/>
+        </w:rPr>
+        <w:t xml:space="preserve"> </w:t>
+      </w:r>
+      <w:r>
+        <w:t>See Glossary [G4]</w:t>
       </w:r>
     </w:p>
     <w:p>
@@ -1492,7 +1535,20 @@
         <w:t>Server</w:t>
       </w:r>
       <w:r>
-        <w:t>: The backend system responsible for processing logic, managing the database, and generating bot responses.</w:t>
+        <w:rPr>
+          <w:b/>
+          <w:bCs/>
+        </w:rPr>
+        <w:t xml:space="preserve"> – </w:t>
+      </w:r>
+      <w:r>
+        <w:t>See Glossary [G</w:t>
+      </w:r>
+      <w:r>
+        <w:t>11</w:t>
+      </w:r>
+      <w:r>
+        <w:t>]</w:t>
       </w:r>
     </w:p>
     <w:p>
@@ -1512,7 +1568,20 @@
         <w:t>API (Application Programming Interface)</w:t>
       </w:r>
       <w:r>
-        <w:t>: A set of rules and protocols that allows the client and server to communicate and exchange data.</w:t>
+        <w:rPr>
+          <w:b/>
+          <w:bCs/>
+        </w:rPr>
+        <w:t xml:space="preserve"> - </w:t>
+      </w:r>
+      <w:r>
+        <w:t>See Glossary [G</w:t>
+      </w:r>
+      <w:r>
+        <w:t>1</w:t>
+      </w:r>
+      <w:r>
+        <w:t>]</w:t>
       </w:r>
     </w:p>
     <w:p>
@@ -1532,7 +1601,20 @@
         <w:t>Persistence</w:t>
       </w:r>
       <w:r>
-        <w:t>: The characteristic of data that outlives the process that created it, achieved in this system by storing chat messages and profiles in a database.</w:t>
+        <w:rPr>
+          <w:b/>
+          <w:bCs/>
+        </w:rPr>
+        <w:t xml:space="preserve"> - </w:t>
+      </w:r>
+      <w:r>
+        <w:t>See Glossary [G</w:t>
+      </w:r>
+      <w:r>
+        <w:t>8</w:t>
+      </w:r>
+      <w:r>
+        <w:t>]</w:t>
       </w:r>
     </w:p>
     <w:p>
@@ -1552,7 +1634,20 @@
         <w:t>Rule-Based Logic</w:t>
       </w:r>
       <w:r>
-        <w:t>: A simple decision-making system where the bot provides specific outputs based on exact keyword matches or predefined commands.</w:t>
+        <w:rPr>
+          <w:b/>
+          <w:bCs/>
+        </w:rPr>
+        <w:t xml:space="preserve"> - </w:t>
+      </w:r>
+      <w:r>
+        <w:t>See Glossary [G</w:t>
+      </w:r>
+      <w:r>
+        <w:t>10</w:t>
+      </w:r>
+      <w:r>
+        <w:t>]</w:t>
       </w:r>
     </w:p>
     <w:p>
@@ -1572,7 +1667,20 @@
         <w:t>UI (User Interface)</w:t>
       </w:r>
       <w:r>
-        <w:t>: The visual part of the client application through which the user interacts with the system.</w:t>
+        <w:rPr>
+          <w:b/>
+          <w:bCs/>
+        </w:rPr>
+        <w:t xml:space="preserve"> - </w:t>
+      </w:r>
+      <w:r>
+        <w:t>See Glossary [G</w:t>
+      </w:r>
+      <w:r>
+        <w:t>13</w:t>
+      </w:r>
+      <w:r>
+        <w:t>]</w:t>
       </w:r>
     </w:p>
     <w:p>
@@ -1592,7 +1700,27 @@
         <w:t>JSON (JavaScript Object Notation)</w:t>
       </w:r>
       <w:r>
-        <w:t>: A lightweight, text-based data interchange format used by the server to export chat logs.</w:t>
+        <w:rPr>
+          <w:b/>
+          <w:bCs/>
+        </w:rPr>
+        <w:t xml:space="preserve"> - </w:t>
+      </w:r>
+      <w:r>
+        <w:t>See Glossary [G</w:t>
+      </w:r>
+      <w:r>
+        <w:t>7</w:t>
+      </w:r>
+      <w:r>
+        <w:t>]</w:t>
+      </w:r>
+      <w:r>
+        <w:rPr>
+          <w:b/>
+          <w:bCs/>
+        </w:rPr>
+        <w:t xml:space="preserve"> </w:t>
       </w:r>
     </w:p>
     <w:p>
@@ -1612,7 +1740,20 @@
         <w:t>XML (eXtensible Markup Language)</w:t>
       </w:r>
       <w:r>
-        <w:t>: A markup language that defines a set of rules for encoding documents in a format that is both human-readable and machine-readable, used for log exports.</w:t>
+        <w:rPr>
+          <w:b/>
+          <w:bCs/>
+        </w:rPr>
+        <w:t xml:space="preserve"> - </w:t>
+      </w:r>
+      <w:r>
+        <w:t>See Glossary [G</w:t>
+      </w:r>
+      <w:r>
+        <w:t>15</w:t>
+      </w:r>
+      <w:r>
+        <w:t>]</w:t>
       </w:r>
     </w:p>
     <w:p>
@@ -1652,7 +1793,6 @@
         </w:numPr>
       </w:pPr>
       <w:r>
-        <w:lastRenderedPageBreak/>
         <w:t xml:space="preserve">Chatbot design: </w:t>
       </w:r>
       <w:hyperlink r:id="rId9" w:history="1">
@@ -1719,6 +1859,7 @@
         </w:numPr>
       </w:pPr>
       <w:r>
+        <w:lastRenderedPageBreak/>
         <w:t>Rule-Based Chatbots: Examples &amp; Possible Applications</w:t>
       </w:r>
       <w:r>
@@ -1771,7 +1912,7 @@
         <w:t xml:space="preserve">: </w:t>
       </w:r>
       <w:r>
-        <w:t>https://herothemes.com/blog/rule-based-chatbots/</w:t>
+        <w:t>https://herothemes.com/blog/rule-based-chatbots</w:t>
       </w:r>
     </w:p>
     <w:p/>
@@ -1852,6 +1993,12 @@
       <w:r>
         <w:t xml:space="preserve"> - Outlines the high-level technical constraints, including hardware requirements, platform standards, and performance expectations necessary for a successful implementation.</w:t>
       </w:r>
+    </w:p>
+    <w:p>
+      <w:pPr>
+        <w:pStyle w:val="ListParagraph"/>
+        <w:jc w:val="both"/>
+      </w:pPr>
     </w:p>
     <w:p>
       <w:pPr>
@@ -1896,8 +2043,13 @@
       <w:pPr>
         <w:pStyle w:val="Heading2"/>
       </w:pPr>
-      <w:bookmarkStart w:id="6" w:name="_qnd3zqp496x" w:colFirst="0" w:colLast="0"/>
-      <w:bookmarkEnd w:id="6"/>
+    </w:p>
+    <w:p/>
+    <w:p/>
+    <w:p>
+      <w:pPr>
+        <w:pStyle w:val="Heading2"/>
+      </w:pPr>
       <w:r>
         <w:lastRenderedPageBreak/>
         <w:t>2.2 Problem Statement</w:t>
@@ -2153,8 +2305,8 @@
       <w:pPr>
         <w:pStyle w:val="Heading2"/>
       </w:pPr>
-      <w:bookmarkStart w:id="7" w:name="_9rcetpubfiwh" w:colFirst="0" w:colLast="0"/>
-      <w:bookmarkEnd w:id="7"/>
+      <w:bookmarkStart w:id="6" w:name="_9rcetpubfiwh" w:colFirst="0" w:colLast="0"/>
+      <w:bookmarkEnd w:id="6"/>
     </w:p>
     <w:p>
       <w:pPr>
@@ -2540,8 +2692,8 @@
       <w:pPr>
         <w:pStyle w:val="Heading1"/>
       </w:pPr>
-      <w:bookmarkStart w:id="8" w:name="_b9fuoaumw500" w:colFirst="0" w:colLast="0"/>
-      <w:bookmarkEnd w:id="8"/>
+      <w:bookmarkStart w:id="7" w:name="_b9fuoaumw500" w:colFirst="0" w:colLast="0"/>
+      <w:bookmarkEnd w:id="7"/>
     </w:p>
     <w:p/>
     <w:p>
@@ -2557,8 +2709,8 @@
       <w:pPr>
         <w:pStyle w:val="Heading2"/>
       </w:pPr>
-      <w:bookmarkStart w:id="9" w:name="_kacqszm0rg4u" w:colFirst="0" w:colLast="0"/>
-      <w:bookmarkEnd w:id="9"/>
+      <w:bookmarkStart w:id="8" w:name="_kacqszm0rg4u" w:colFirst="0" w:colLast="0"/>
+      <w:bookmarkEnd w:id="8"/>
       <w:r>
         <w:t>3.1 Stakeholder Summary</w:t>
       </w:r>
@@ -3150,8 +3302,8 @@
       <w:pPr>
         <w:pStyle w:val="Heading2"/>
       </w:pPr>
-      <w:bookmarkStart w:id="10" w:name="_bjfxvju20xz3" w:colFirst="0" w:colLast="0"/>
-      <w:bookmarkEnd w:id="10"/>
+      <w:bookmarkStart w:id="9" w:name="_bjfxvju20xz3" w:colFirst="0" w:colLast="0"/>
+      <w:bookmarkEnd w:id="9"/>
       <w:r>
         <w:t>3.2 User Summary</w:t>
       </w:r>
@@ -3581,8 +3733,8 @@
       <w:pPr>
         <w:pStyle w:val="Heading2"/>
       </w:pPr>
-      <w:bookmarkStart w:id="11" w:name="_fw2ujwke3oj0" w:colFirst="0" w:colLast="0"/>
-      <w:bookmarkEnd w:id="11"/>
+      <w:bookmarkStart w:id="10" w:name="_fw2ujwke3oj0" w:colFirst="0" w:colLast="0"/>
+      <w:bookmarkEnd w:id="10"/>
     </w:p>
     <w:p>
       <w:pPr>
@@ -3606,7 +3758,21 @@
           <w:b/>
           <w:bCs/>
         </w:rPr>
-        <w:t>Number of peope involved</w:t>
+        <w:t>Number of peop</w:t>
+      </w:r>
+      <w:r>
+        <w:rPr>
+          <w:b/>
+          <w:bCs/>
+        </w:rPr>
+        <w:t>l</w:t>
+      </w:r>
+      <w:r>
+        <w:rPr>
+          <w:b/>
+          <w:bCs/>
+        </w:rPr>
+        <w:t>e involved</w:t>
       </w:r>
       <w:r>
         <w:t>: The interaction is primarily one-on-one: a single user interacting with the rule-based bot. While the system can support multiple users simultaneously via the server, each chat session is private. The System Administrator monitors the backend but does not interfere with individual user sessions.</w:t>
@@ -3761,8 +3927,8 @@
       <w:pPr>
         <w:pStyle w:val="Heading1"/>
       </w:pPr>
-      <w:bookmarkStart w:id="12" w:name="_o7jwzigaruns" w:colFirst="0" w:colLast="0"/>
-      <w:bookmarkEnd w:id="12"/>
+      <w:bookmarkStart w:id="11" w:name="_o7jwzigaruns" w:colFirst="0" w:colLast="0"/>
+      <w:bookmarkEnd w:id="11"/>
       <w:r>
         <w:t>4. Product Requirements</w:t>
       </w:r>
@@ -4188,7 +4354,7 @@
   <w:abstractNum w:abstractNumId="2" w15:restartNumberingAfterBreak="0">
     <w:nsid w:val="45A74E81"/>
     <w:multiLevelType w:val="hybridMultilevel"/>
-    <w:tmpl w:val="BB30C34C"/>
+    <w:tmpl w:val="1F9E35C6"/>
     <w:lvl w:ilvl="0" w:tplc="04090001">
       <w:start w:val="1"/>
       <w:numFmt w:val="bullet"/>
@@ -5289,7 +5455,6 @@
   <w:style w:type="character" w:default="1" w:styleId="DefaultParagraphFont">
     <w:name w:val="Default Paragraph Font"/>
     <w:uiPriority w:val="1"/>
-    <w:semiHidden/>
     <w:unhideWhenUsed/>
   </w:style>
   <w:style w:type="table" w:default="1" w:styleId="TableNormal">

</xml_diff>